<commit_message>
Fixed Word Headings. Changed terms to Indian English
</commit_message>
<xml_diff>
--- a/documentation/Thesis_EMAAI_HRL_Srinivas_Rao_Tammireddy_fixed.docx
+++ b/documentation/Thesis_EMAAI_HRL_Srinivas_Rao_Tammireddy_fixed.docx
@@ -370,6 +370,7 @@
     </w:p>
     <w:p>
       <w:pPr>
+        <w:pStyle w:val="Heading1"/>
         <w:spacing w:after="400" w:before="200"/>
         <w:jc w:val="center"/>
       </w:pPr>
@@ -532,6 +533,7 @@
     </w:p>
     <w:p>
       <w:pPr>
+        <w:pStyle w:val="Heading1"/>
         <w:spacing w:after="400" w:before="200"/>
         <w:jc w:val="center"/>
       </w:pPr>
@@ -817,6 +819,7 @@
     </w:p>
     <w:p>
       <w:pPr>
+        <w:pStyle w:val="Heading1"/>
         <w:spacing w:after="400" w:before="200"/>
         <w:jc w:val="center"/>
       </w:pPr>
@@ -978,6 +981,7 @@
     </w:p>
     <w:p>
       <w:pPr>
+        <w:pStyle w:val="Heading1"/>
         <w:spacing w:after="400" w:before="200"/>
         <w:jc w:val="center"/>
       </w:pPr>
@@ -1044,7 +1048,7 @@
           <w:sz w:val="24"/>
           <w:szCs w:val="24"/>
         </w:rPr>
-        <w:t xml:space="preserve">A dedicated Explainability Engine is integrated into the framework to provide interpretable insights into agent decision-making. The engine employs action justification, policy visualization, and decision traceability mechanisms to generate human-comprehensible explanations of agent behavior. These explanations facilitate system monitoring, debugging, and regulatory compliance in deployed autonomous systems.</w:t>
+        <w:t xml:space="preserve">A dedicated Explainability Engine is integrated into the framework to provide interpretable insights into agent decision-making. The engine employs action justification, policy visualisation, and decision traceability mechanisms to generate human-comprehensible explanations of agent behaviour. These explanations facilitate system monitoring, debugging, and regulatory compliance in deployed autonomous systems.</w:t>
       </w:r>
     </w:p>
     <w:p>
@@ -1058,7 +1062,7 @@
           <w:sz w:val="24"/>
           <w:szCs w:val="24"/>
         </w:rPr>
-        <w:t xml:space="preserve">The proposed framework was rigorously evaluated on simulated autonomous coordination scenarios and benchmarked against conventional reinforcement learning, standard multi-agent reinforcement learning, and hierarchical reinforcement learning approaches. The experimental results demonstrate that the proposed framework achieves a training accuracy of 96.4% and validation accuracy of 95.7%, with minimal training loss of 0.14 and validation loss of 0.17 after 50 training epochs. Performance metrics including precision (95.9%), recall (97.1%), and F1-score (96.5%) confirm the superiority of the proposed approach. Coordination efficiency metrics further validate the framework with a task completion rate of 96.2%, coordination success rate of 95.4%, and average decision time of 103 milliseconds. The ROC analysis demonstrates excellent discriminative capability between coordinated and non-coordinated agent behaviors.</w:t>
+        <w:t xml:space="preserve">The proposed framework was rigorously evaluated on simulated autonomous coordination scenarios and benchmarked against conventional reinforcement learning, standard multi-agent reinforcement learning, and hierarchical reinforcement learning approaches. The experimental results demonstrate that the proposed framework achieves a training accuracy of 96.4% and validation accuracy of 95.7%, with minimal training loss of 0.14 and validation loss of 0.17 after 50 training epochs. Performance metrics including precision (95.9%), recall (97.1%), and F1-score (96.5%) confirm the superiority of the proposed approach. Coordination efficiency metrics further validate the framework with a task completion rate of 96.2%, coordination success rate of 95.4%, and average decision time of 103 milliseconds. The ROC analysis demonstrates excellent discriminative capability between coordinated and non-coordinated agent behaviours.</w:t>
       </w:r>
     </w:p>
     <w:p>
@@ -1114,6 +1118,7 @@
     </w:p>
     <w:p>
       <w:pPr>
+        <w:pStyle w:val="Heading1"/>
         <w:spacing w:after="400" w:before="200"/>
         <w:jc w:val="center"/>
       </w:pPr>
@@ -4922,6 +4927,7 @@
     </w:p>
     <w:p>
       <w:pPr>
+        <w:pStyle w:val="Heading1"/>
         <w:spacing w:after="400" w:before="200"/>
         <w:jc w:val="center"/>
       </w:pPr>
@@ -6192,6 +6198,7 @@
     </w:p>
     <w:p>
       <w:pPr>
+        <w:pStyle w:val="Heading1"/>
         <w:spacing w:after="400" w:before="200"/>
         <w:jc w:val="center"/>
       </w:pPr>
@@ -7260,6 +7267,7 @@
     </w:p>
     <w:p>
       <w:pPr>
+        <w:pStyle w:val="Heading1"/>
         <w:spacing w:after="400" w:before="200"/>
         <w:jc w:val="center"/>
       </w:pPr>
@@ -8116,7 +8124,7 @@
                 <w:sz w:val="24"/>
                 <w:szCs w:val="24"/>
               </w:rPr>
-              <w:t xml:space="preserve">Proximal Policy Optimization</w:t>
+              <w:t xml:space="preserve">Proximal Policy Optimisation</w:t>
             </w:r>
           </w:p>
         </w:tc>
@@ -8932,7 +8940,7 @@
                 <w:sz w:val="24"/>
                 <w:szCs w:val="24"/>
               </w:rPr>
-              <w:t xml:space="preserve">Centralized Training with Decentralized Execution</w:t>
+              <w:t xml:space="preserve">Centralised Training with Decentralised Execution</w:t>
             </w:r>
           </w:p>
         </w:tc>
@@ -8948,6 +8956,7 @@
     </w:p>
     <w:p>
       <w:pPr>
+        <w:pStyle w:val="Heading1"/>
         <w:spacing w:after="400" w:before="200"/>
         <w:jc w:val="center"/>
       </w:pPr>
@@ -8982,6 +8991,7 @@
     </w:p>
     <w:p>
       <w:pPr>
+        <w:pStyle w:val="Heading2"/>
         <w:spacing w:after="160" w:before="320"/>
       </w:pPr>
       <w:r>
@@ -9020,7 +9030,7 @@
           <w:sz w:val="24"/>
           <w:szCs w:val="24"/>
         </w:rPr>
-        <w:t xml:space="preserve">Reinforcement learning, and more specifically Multi-Agent Reinforcement Learning (MARL), has emerged as a compelling paradigm for enabling autonomous agents to learn cooperative coordination behaviors through iterative interactions with the environment. In a MARL framework, agents independently observe their local environments, select actions based on learned policies, and receive reward signals that guide the evolution of their behavioral strategies toward globally optimal outcomes. The capability of MARL to operate in dynamic, model-free settings without requiring explicit environment modeling has driven its adoption in collaborative robotics, autonomous vehicle coordination, distributed control systems, and intelligent traffic management.</w:t>
+        <w:t xml:space="preserve">Reinforcement learning, and more specifically Multi-Agent Reinforcement Learning (MARL), has emerged as a compelling paradigm for enabling autonomous agents to learn cooperative coordination behaviours through iterative interactions with the environment. In a MARL framework, agents independently observe their local environments, select actions based on learned policies, and receive reward signals that guide the evolution of their behavioural strategies toward globally optimal outcomes. The capability of MARL to operate in dynamic, model-free settings without requiring explicit environment modelling has driven its adoption in collaborative robotics, autonomous vehicle coordination, distributed control systems, and intelligent traffic management.</w:t>
       </w:r>
     </w:p>
     <w:p>
@@ -9034,7 +9044,7 @@
           <w:sz w:val="24"/>
           <w:szCs w:val="24"/>
         </w:rPr>
-        <w:t xml:space="preserve">Despite the demonstrated effectiveness of MARL in complex coordination tasks, a fundamental challenge persists: the learned policies are typically encoded within high-dimensional neural network architectures that function as opaque black-box models. The internal decision-making mechanisms of these models are inherently difficult to interpret, making it challenging for system operators and domain experts to understand, trust, and audit the behavioral strategies of autonomous agents. This opacity is particularly problematic in safety-critical deployment scenarios — such as autonomous medical systems, aerospace control, and industrial automation — where regulatory standards mandate interpretable and auditable AI behavior.</w:t>
+        <w:t xml:space="preserve">Despite the demonstrated effectiveness of MARL in complex coordination tasks, a fundamental challenge persists: the learned policies are typically encoded within high-dimensional neural network architectures that function as opaque black-box models. The internal decision-making mechanisms of these models are inherently difficult to interpret, making it challenging for system operators and domain experts to understand, trust, and audit the behavioural strategies of autonomous agents. This opacity is particularly problematic in safety-critical deployment scenarios — such as autonomous medical systems, aerospace control, and industrial automation — where regulatory standards mandate interpretable and auditable AI behaviour.</w:t>
       </w:r>
     </w:p>
     <w:p>
@@ -9048,7 +9058,7 @@
           <w:sz w:val="24"/>
           <w:szCs w:val="24"/>
         </w:rPr>
-        <w:t xml:space="preserve">Hierarchical Reinforcement Learning (HRL) offers a principled approach to addressing the scalability and complexity challenges inherent in conventional MARL frameworks. By decomposing complex coordination tasks into a hierarchy of sub-goals and corresponding sub-policies, HRL enables agents to reason at multiple levels of temporal and spatial abstraction. High-level policies formulate strategic objectives and coordinate macro-level agent behaviors, while low-level policies handle fine-grained action execution within bounded temporal horizons. This hierarchical decomposition reduces the effective state-action search space, accelerates convergence of the learning process, and facilitates transfer of learned behaviors across related tasks.</w:t>
+        <w:t xml:space="preserve">Hierarchical Reinforcement Learning (HRL) offers a principled approach to addressing the scalability and complexity challenges inherent in conventional MARL frameworks. By decomposing complex coordination tasks into a hierarchy of sub-goals and corresponding sub-policies, HRL enables agents to reason at multiple levels of temporal and spatial abstraction. High-level policies formulate strategic objectives and coordinate macro-level agent behaviours, while low-level policies handle fine-grained action execution within bounded temporal horizons. This hierarchical decomposition reduces the effective state-action search space, accelerates convergence of the learning process, and facilitates transfer of learned behaviours across related tasks.</w:t>
       </w:r>
     </w:p>
     <w:p>
@@ -9062,7 +9072,7 @@
           <w:sz w:val="24"/>
           <w:szCs w:val="24"/>
         </w:rPr>
-        <w:t xml:space="preserve">The integration of explainability mechanisms into the HRL framework represents a crucial advancement toward realizing trustworthy and accountable autonomous multi-agent systems. Explainable AI (XAI) techniques provide mechanisms for generating human-comprehensible representations of model decision-making, including saliency maps, attention weights, policy trees, and natural language justifications. By embedding such mechanisms within the multi-agent HRL architecture, it becomes possible to provide real-time explanations of agent actions, visualize learned coordination policies, and maintain complete traces of decision histories — all of which are essential for system monitoring, failure diagnosis, and regulatory compliance.</w:t>
+        <w:t xml:space="preserve">The integration of explainability mechanisms into the HRL framework represents a crucial advancement toward realizing trustworthy and accountable autonomous multi-agent systems. Explainable AI (XAI) techniques provide mechanisms for generating human-comprehensible representations of model decision-making, including saliency maps, attention weights, policy trees, and natural language justifications. By embedding such mechanisms within the multi-agent HRL architecture, it becomes possible to provide real-time explanations of agent actions, visualise learned coordination policies, and maintain complete traces of decision histories — all of which are essential for system monitoring, failure diagnosis, and regulatory compliance.</w:t>
       </w:r>
     </w:p>
     <w:p>
@@ -9081,6 +9091,7 @@
     </w:p>
     <w:p>
       <w:pPr>
+        <w:pStyle w:val="Heading2"/>
         <w:spacing w:after="160" w:before="320"/>
       </w:pPr>
       <w:r>
@@ -9119,7 +9130,7 @@
           <w:sz w:val="24"/>
           <w:szCs w:val="24"/>
         </w:rPr>
-        <w:t xml:space="preserve">The advent of machine learning, and particularly deep learning, introduced a new generation of data-driven approaches to multi-agent coordination. Deep reinforcement learning methods, which combine the representational power of deep neural networks with the reward-based optimization framework of reinforcement learning, have demonstrated remarkable success in a variety of complex sequential decision-making tasks. The seminal work on Deep Q-Networks (DQN) demonstrated that neural network function approximators could learn superhuman policies in discrete action spaces, while subsequent developments in policy gradient methods, actor-critic architectures, and model-based reinforcement learning extended these capabilities to continuous action spaces and more complex task structures.</w:t>
+        <w:t xml:space="preserve">The advent of machine learning, and particularly deep learning, introduced a new generation of data-driven approaches to multi-agent coordination. Deep reinforcement learning methods, which combine the representational power of deep neural networks with the reward-based optimisation framework of reinforcement learning, have demonstrated remarkable success in a variety of complex sequential decision-making tasks. The seminal work on Deep Q-Networks (DQN) demonstrated that neural network function approximators could learn superhuman policies in discrete action spaces, while subsequent developments in policy gradient methods, actor-critic architectures, and model-based reinforcement learning extended these capabilities to continuous action spaces and more complex task structures.</w:t>
       </w:r>
     </w:p>
     <w:p>
@@ -9133,7 +9144,7 @@
           <w:sz w:val="24"/>
           <w:szCs w:val="24"/>
         </w:rPr>
-        <w:t xml:space="preserve">The extension of deep reinforcement learning to multi-agent settings introduced additional layers of complexity. In a multi-agent environment, each agent must simultaneously learn to optimize its own policy while accounting for the evolving policies of other agents, creating a non-stationary learning environment that violates the stationarity assumptions underlying single-agent reinforcement learning theory. Centralized Training with Decentralized Execution (CTDE) has emerged as a widely adopted architectural paradigm for MARL, enabling agents to exploit global state information during training while maintaining decentralized, communication-free execution during deployment. However, CTDE approaches still face significant challenges in terms of scalability, sample efficiency, and — most critically — interpretability.</w:t>
+        <w:t xml:space="preserve">The extension of deep reinforcement learning to multi-agent settings introduced additional layers of complexity. In a multi-agent environment, each agent must simultaneously learn to optimise its own policy while accounting for the evolving policies of other agents, creating a non-stationary learning environment that violates the stationarity assumptions underlying single-agent reinforcement learning theory. Centralised Training with Decentralised Execution (CTDE) has emerged as a widely adopted architectural paradigm for MARL, enabling agents to exploit global state information during training while maintaining decentralised, communication-free execution during deployment. However, CTDE approaches still face significant challenges in terms of scalability, sample efficiency, and — most critically — interpretability.</w:t>
       </w:r>
     </w:p>
     <w:p>
@@ -9161,7 +9172,7 @@
           <w:sz w:val="24"/>
           <w:szCs w:val="24"/>
         </w:rPr>
-        <w:t xml:space="preserve">Hierarchical Reinforcement Learning approaches the scalability and complexity challenge from a different perspective. The theoretical foundation of HRL is grounded in the options framework, in which an option is defined as a temporally extended course of action consisting of a policy, an initiation set, and a termination condition. By operating at multiple temporal scales simultaneously, HRL enables agents to plan at high levels of abstraction while delegating specific execution details to lower-level sub-policies. Feudal Networks, the Options-Critic architecture, and Goal-Conditioned RL are representative examples of HRL approaches that have demonstrated improved sample efficiency and generalization compared to flat policy approaches in complex environments.</w:t>
+        <w:t xml:space="preserve">Hierarchical Reinforcement Learning approaches the scalability and complexity challenge from a different perspective. The theoretical foundation of HRL is grounded in the options framework, in which an option is defined as a temporally extended course of action consisting of a policy, an initiation set, and a termination condition. By operating at multiple temporal scales simultaneously, HRL enables agents to plan at high levels of abstraction while delegating specific execution details to lower-level sub-policies. Feudal Networks, the Options-Critic architecture, and Goal-Conditioned RL are representative examples of HRL approaches that have demonstrated improved sample efficiency and generalisation compared to flat policy approaches in complex environments.</w:t>
       </w:r>
     </w:p>
     <w:p>
@@ -9180,6 +9191,7 @@
     </w:p>
     <w:p>
       <w:pPr>
+        <w:pStyle w:val="Heading2"/>
         <w:spacing w:after="160" w:before="320"/>
       </w:pPr>
       <w:r>
@@ -9232,7 +9244,7 @@
           <w:sz w:val="24"/>
           <w:szCs w:val="24"/>
         </w:rPr>
-        <w:t xml:space="preserve">Beyond regulatory compliance, the operational benefits of explainability are substantial. System operators who can understand and predict agent decision-making are better equipped to identify emergent failure modes, to intervene when agent behavior deviates from intended objectives, and to adapt system configurations to changing operational requirements. The capacity to explain why a coordination decision was made — in terms comprehensible to non-expert operators — significantly lowers the barrier to adoption of autonomous coordination technology in domains currently reliant on human coordination.</w:t>
+        <w:t xml:space="preserve">Beyond regulatory compliance, the operational benefits of explainability are substantial. System operators who can understand and predict agent decision-making are better equipped to identify emergent failure modes, to intervene when agent behaviour deviates from intended objectives, and to adapt system configurations to changing operational requirements. The capacity to explain why a coordination decision was made — in terms comprehensible to non-expert operators — significantly lowers the barrier to adoption of autonomous coordination technology in domains currently reliant on human coordination.</w:t>
       </w:r>
     </w:p>
     <w:p>
@@ -9260,11 +9272,12 @@
           <w:sz w:val="24"/>
           <w:szCs w:val="24"/>
         </w:rPr>
-        <w:t xml:space="preserve">Furthermore, the demonstrated success of hierarchical approaches in improving sample efficiency and generalization in single-agent RL settings provides strong empirical motivation for exploring their extension to the multi-agent setting with explicit explainability support. The potential for significant improvements in both learning efficiency and coordination performance — relative to both flat MARL approaches and interpretability-agnostic HRL methods — represents a compelling scientific motivation for the proposed research.</w:t>
-      </w:r>
-    </w:p>
-    <w:p>
-      <w:pPr>
+        <w:t xml:space="preserve">Furthermore, the demonstrated success of hierarchical approaches in improving sample efficiency and generalisation in single-agent RL settings provides strong empirical motivation for exploring their extension to the multi-agent setting with explicit explainability support. The potential for significant improvements in both learning efficiency and coordination performance — relative to both flat MARL approaches and interpretability-agnostic HRL methods — represents a compelling scientific motivation for the proposed research.</w:t>
+      </w:r>
+    </w:p>
+    <w:p>
+      <w:pPr>
+        <w:pStyle w:val="Heading2"/>
         <w:spacing w:after="160" w:before="320"/>
       </w:pPr>
       <w:r>
@@ -9331,7 +9344,7 @@
           <w:sz w:val="24"/>
           <w:szCs w:val="24"/>
         </w:rPr>
-        <w:t xml:space="preserve">Third, the coordination efficiency challenge: the framework must enable agents to achieve high task completion rates, effective resource utilization, and low decision latency across a range of coordination scenarios, including scenarios characterized by dynamic task arrival, agent failures, and environmental perturbations. The coordination mechanisms must be robust to partial observability and communication constraints, which are common features of real-world multi-agent deployment contexts.</w:t>
+        <w:t xml:space="preserve">Third, the coordination efficiency challenge: the framework must enable agents to achieve high task completion rates, effective resource utilization, and low decision latency across a range of coordination scenarios, including scenarios characterised by dynamic task arrival, agent failures, and environmental perturbations. The coordination mechanisms must be robust to partial observability and communication constraints, which are common features of real-world multi-agent deployment contexts.</w:t>
       </w:r>
     </w:p>
     <w:p>
@@ -9350,6 +9363,7 @@
     </w:p>
     <w:p>
       <w:pPr>
+        <w:pStyle w:val="Heading2"/>
         <w:spacing w:after="160" w:before="320"/>
       </w:pPr>
       <w:r>
@@ -9402,7 +9416,7 @@
           <w:sz w:val="24"/>
           <w:szCs w:val="24"/>
         </w:rPr>
-        <w:t xml:space="preserve">The Hierarchical Reinforcement Learning Module implements a two-level policy hierarchy. The high-level policy operates at a coarse temporal scale and is responsible for selecting strategic macro-actions or sub-goal assignments that coordinate the overall behaviors of the agent population. The low-level policy operates at a fine temporal scale and implements specific action sequences necessary to accomplish the sub-goals assigned by the high-level policy. This hierarchical structure reduces the effective search space, accelerates learning convergence, and provides natural points of abstraction for explanation generation.</w:t>
+        <w:t xml:space="preserve">The Hierarchical Reinforcement Learning Module implements a two-level policy hierarchy. The high-level policy operates at a coarse temporal scale and is responsible for selecting strategic macro-actions or sub-goal assignments that coordinate the overall behaviours of the agent population. The low-level policy operates at a fine temporal scale and implements specific action sequences necessary to accomplish the sub-goals assigned by the high-level policy. This hierarchical structure reduces the effective search space, accelerates learning convergence, and provides natural points of abstraction for explanation generation.</w:t>
       </w:r>
     </w:p>
     <w:p>
@@ -9416,7 +9430,7 @@
           <w:sz w:val="24"/>
           <w:szCs w:val="24"/>
         </w:rPr>
-        <w:t xml:space="preserve">The Explainability Engine is integrated throughout the policy evaluation pipeline and provides three modes of explanation output: action justification, which explains in human-readable terms why a specific action was selected at a given decision point; policy visualization, which provides graphical representations of the learned policy landscape and coordination patterns; and decision traceability, which maintains a complete audit trail of agent decisions, sub-goal assignments, and reward signals over the course of task execution. These explanation capabilities directly address the regulatory and operational transparency requirements articulated in the problem statement.</w:t>
+        <w:t xml:space="preserve">The Explainability Engine is integrated throughout the policy evaluation pipeline and provides three modes of explanation output: action justification, which explains in human-readable terms why a specific action was selected at a given decision point; policy visualisation, which provides graphical representations of the learned policy landscape and coordination patterns; and decision traceability, which maintains a complete audit trail of agent decisions, sub-goal assignments, and reward signals over the course of task execution. These explanation capabilities directly address the regulatory and operational transparency requirements articulated in the problem statement.</w:t>
       </w:r>
     </w:p>
     <w:p>
@@ -9435,6 +9449,7 @@
     </w:p>
     <w:p>
       <w:pPr>
+        <w:pStyle w:val="Heading2"/>
         <w:spacing w:after="160" w:before="320"/>
       </w:pPr>
       <w:r>
@@ -9513,7 +9528,7 @@
           <w:sz w:val="24"/>
           <w:szCs w:val="24"/>
         </w:rPr>
-        <w:t xml:space="preserve">To implement and evaluate comprehensive action justification, policy visualization, and decision traceability mechanisms that satisfy the transparency and auditability requirements of safety-critical autonomous system deployment.</w:t>
+        <w:t xml:space="preserve">To implement and evaluate comprehensive action justification, policy visualisation, and decision traceability mechanisms that satisfy the transparency and auditability requirements of safety-critical autonomous system deployment.</w:t>
       </w:r>
     </w:p>
     <w:p>
@@ -9549,7 +9564,7 @@
           <w:sz w:val="24"/>
           <w:szCs w:val="24"/>
         </w:rPr>
-        <w:t xml:space="preserve">To analyze the trade-offs between coordination performance, learning efficiency, and explainability overhead within the proposed framework, identifying optimal configuration strategies for different application contexts.</w:t>
+        <w:t xml:space="preserve">To analyse the trade-offs between coordination performance, learning efficiency, and explainability overhead within the proposed framework, identifying optimal configuration strategies for different application contexts.</w:t>
       </w:r>
     </w:p>
     <w:p>
@@ -9585,6 +9600,7 @@
     </w:p>
     <w:p>
       <w:pPr>
+        <w:pStyle w:val="Heading2"/>
         <w:spacing w:after="160" w:before="320"/>
       </w:pPr>
       <w:r>
@@ -9609,7 +9625,7 @@
           <w:sz w:val="24"/>
           <w:szCs w:val="24"/>
         </w:rPr>
-        <w:t xml:space="preserve">The research presented in this thesis is scoped to address the design, implementation, and experimental evaluation of the EMAAI-HRL framework within simulated multi-agent coordination environments. The primary focus is on fully cooperative multi-agent scenarios in which all agents share a common reward objective and are designed to maximize collective task performance. The framework is evaluated on coordination scenarios characterized by dynamic task assignment, variable numbers of agents, and stochastic environment transitions.</w:t>
+        <w:t xml:space="preserve">The research presented in this thesis is scoped to address the design, implementation, and experimental evaluation of the EMAAI-HRL framework within simulated multi-agent coordination environments. The primary focus is on fully cooperative multi-agent scenarios in which all agents share a common reward objective and are designed to maximize collective task performance. The framework is evaluated on coordination scenarios characterised by dynamic task assignment, variable numbers of agents, and stochastic environment transitions.</w:t>
       </w:r>
     </w:p>
     <w:p>
@@ -9637,11 +9653,12 @@
           <w:sz w:val="24"/>
           <w:szCs w:val="24"/>
         </w:rPr>
-        <w:t xml:space="preserve">The mathematical formulations presented in Chapter 3 are grounded in standard reinforcement learning theory and do not assume specialized hardware accelerators beyond GPU-based deep learning computation. The scope of the dataset description is limited to synthetic simulation data generated within the evaluation environment, acknowledging that the application to real-world sensor data would require additional preprocessing and domain adaptation procedures beyond the scope of this thesis.</w:t>
-      </w:r>
-    </w:p>
-    <w:p>
-      <w:pPr>
+        <w:t xml:space="preserve">The mathematical formulations presented in Chapter 3 are grounded in standard reinforcement learning theory and do not assume specialised hardware accelerators beyond GPU-based deep learning computation. The scope of the dataset description is limited to synthetic simulation data generated within the evaluation environment, acknowledging that the application to real-world sensor data would require additional preprocessing and domain adaptation procedures beyond the scope of this thesis.</w:t>
+      </w:r>
+    </w:p>
+    <w:p>
+      <w:pPr>
+        <w:pStyle w:val="Heading2"/>
         <w:spacing w:after="160" w:before="320"/>
       </w:pPr>
       <w:r>
@@ -9713,6 +9730,7 @@
     </w:p>
     <w:p>
       <w:pPr>
+        <w:pStyle w:val="Heading2"/>
         <w:spacing w:after="160" w:before="320"/>
       </w:pPr>
       <w:r>
@@ -9779,7 +9797,7 @@
           <w:sz w:val="24"/>
           <w:szCs w:val="24"/>
         </w:rPr>
-        <w:t xml:space="preserve">Chapter 4 — Implementation and Experimental Results: This chapter describes the experimental setup, dataset generation procedures, and implementation details of the proposed framework. The experimental results are presented and analyzed in detail, including quantitative performance comparisons with baseline methods and evaluation of the explainability module.</w:t>
+        <w:t xml:space="preserve">Chapter 4 — Implementation and Experimental Results: This chapter describes the experimental setup, dataset generation procedures, and implementation details of the proposed framework. The experimental results are presented and analysed in detail, including quantitative performance comparisons with baseline methods and evaluation of the explainability module.</w:t>
       </w:r>
     </w:p>
     <w:p>
@@ -9812,6 +9830,7 @@
     </w:p>
     <w:p>
       <w:pPr>
+        <w:pStyle w:val="Heading2"/>
         <w:spacing w:after="160" w:before="320"/>
       </w:pPr>
       <w:r>
@@ -9849,6 +9868,7 @@
     </w:p>
     <w:p>
       <w:pPr>
+        <w:pStyle w:val="Heading1"/>
         <w:spacing w:after="400" w:before="200"/>
         <w:jc w:val="center"/>
       </w:pPr>
@@ -9883,6 +9903,7 @@
     </w:p>
     <w:p>
       <w:pPr>
+        <w:pStyle w:val="Heading2"/>
         <w:spacing w:after="160" w:before="320"/>
       </w:pPr>
       <w:r>
@@ -9912,6 +9933,7 @@
     </w:p>
     <w:p>
       <w:pPr>
+        <w:pStyle w:val="Heading2"/>
         <w:spacing w:after="160" w:before="320"/>
       </w:pPr>
       <w:r>
@@ -9927,6 +9949,7 @@
     </w:p>
     <w:p>
       <w:pPr>
+        <w:pStyle w:val="Heading3"/>
         <w:spacing w:after="100" w:before="200"/>
       </w:pPr>
       <w:r>
@@ -9951,7 +9974,7 @@
           <w:sz w:val="24"/>
           <w:szCs w:val="24"/>
         </w:rPr>
-        <w:t xml:space="preserve">Multi-Agent Reinforcement Learning (MARL) has emerged as the dominant paradigm for learning coordination behaviors in autonomous multi-agent systems. The foundational theoretical framework of MARL is grounded in the extension of Markov Decision Processes (MDPs) to the multi-agent setting, yielding the Stochastic Game formulation in which multiple agents simultaneously act within a shared environment and receive potentially distinct reward signals. The Centralized Training with Decentralized Execution (CTDE) paradigm has become the most widely adopted architectural pattern in cooperative MARL, enabling agents to exploit global state and joint observation information during the training phase while retaining decentralized policy execution during deployment.</w:t>
+        <w:t xml:space="preserve">Multi-Agent Reinforcement Learning (MARL) has emerged as the dominant paradigm for learning coordination behaviours in autonomous multi-agent systems. The foundational theoretical framework of MARL is grounded in the extension of Markov Decision Processes (MDPs) to the multi-agent setting, yielding the Stochastic Game formulation in which multiple agents simultaneously act within a shared environment and receive potentially distinct reward signals. The Centralised Training with Decentralised Execution (CTDE) paradigm has become the most widely adopted architectural pattern in cooperative MARL, enabling agents to exploit global state and joint observation information during the training phase while retaining decentralised policy execution during deployment.</w:t>
       </w:r>
     </w:p>
     <w:p>
@@ -9965,11 +9988,12 @@
           <w:sz w:val="24"/>
           <w:szCs w:val="24"/>
         </w:rPr>
-        <w:t xml:space="preserve">Key algorithmic contributions to cooperative MARL include QMIX, a value-based approach that learns a monotonic mixing function over individual agent Q-values to approximate the optimal joint action-value function; MAPPO, which extends the Proximal Policy Optimization algorithm to the multi-agent setting with shared policy parameterization; and MADDPG, which applies the deterministic policy gradient framework to continuous-action multi-agent environments. These algorithms have demonstrated strong empirical performance on benchmark coordination tasks such as the StarCraft Multi-Agent Challenge (SMAC) and cooperative navigation in the Multi-Agent Particle Environment (MPE). However, none of these approaches provides mechanisms for explaining the coordination decisions made by the learned policies.</w:t>
-      </w:r>
-    </w:p>
-    <w:p>
-      <w:pPr>
+        <w:t xml:space="preserve">Key algorithmic contributions to cooperative MARL include QMIX, a value-based approach that learns a monotonic mixing function over individual agent Q-values to approximate the optimal joint action-value function; MAPPO, which extends the Proximal Policy Optimisation algorithm to the multi-agent setting with shared policy parameterization; and MADDPG, which applies the deterministic policy gradient framework to continuous-action multi-agent environments. These algorithms have demonstrated strong empirical performance on benchmark coordination tasks such as the StarCraft Multi-Agent Challenge (SMAC) and cooperative navigation in the Multi-Agent Particle Environment (MPE). However, none of these approaches provides mechanisms for explaining the coordination decisions made by the learned policies.</w:t>
+      </w:r>
+    </w:p>
+    <w:p>
+      <w:pPr>
+        <w:pStyle w:val="Heading3"/>
         <w:spacing w:after="100" w:before="200"/>
       </w:pPr>
       <w:r>
@@ -10008,11 +10032,12 @@
           <w:sz w:val="24"/>
           <w:szCs w:val="24"/>
         </w:rPr>
-        <w:t xml:space="preserve">In the multi-agent setting, hierarchical approaches have been applied to collaborative task decomposition, where a centralized coordinator assigns sub-tasks to individual agents based on global state information, and individual agents learn to accomplish their assigned sub-tasks through local policy optimization. These approaches have demonstrated improved sample efficiency and coordination stability compared to flat MARL baselines, but they have not addressed the fundamental interpretability challenge posed by neural network policy representations.</w:t>
-      </w:r>
-    </w:p>
-    <w:p>
-      <w:pPr>
+        <w:t xml:space="preserve">In the multi-agent setting, hierarchical approaches have been applied to collaborative task decomposition, where a centralised coordinator assigns sub-tasks to individual agents based on global state information, and individual agents learn to accomplish their assigned sub-tasks through local policy optimisation. These approaches have demonstrated improved sample efficiency and coordination stability compared to flat MARL baselines, but they have not addressed the fundamental interpretability challenge posed by neural network policy representations.</w:t>
+      </w:r>
+    </w:p>
+    <w:p>
+      <w:pPr>
+        <w:pStyle w:val="Heading3"/>
         <w:spacing w:after="100" w:before="200"/>
       </w:pPr>
       <w:r>
@@ -10037,11 +10062,12 @@
           <w:sz w:val="24"/>
           <w:szCs w:val="24"/>
         </w:rPr>
-        <w:t xml:space="preserve">The field of Explainable AI encompasses a diverse set of techniques for generating human-comprehensible representations of machine learning model predictions and decision-making. In the context of reinforcement learning, explanation approaches can be broadly categorized into post-hoc explanation methods — which generate explanations from trained black-box policies without modifying the policy learning process — and intrinsic interpretability methods — which constrain the policy representation to be inherently interpretable at the cost of some performance. Post-hoc methods applicable to RL include saliency-based input attribution, SHAP (SHapley Additive exPlanations), LIME (Local Interpretable Model-agnostic Explanations), and attention mechanism visualization. Intrinsic methods include policy tree extraction, linear function approximation, and Bayesian program synthesis for policy representation.</w:t>
-      </w:r>
-    </w:p>
-    <w:p>
-      <w:pPr>
+        <w:t xml:space="preserve">The field of Explainable AI encompasses a diverse set of techniques for generating human-comprehensible representations of machine learning model predictions and decision-making. In the context of reinforcement learning, explanation approaches can be broadly categorized into post-hoc explanation methods — which generate explanations from trained black-box policies without modifying the policy learning process — and intrinsic interpretability methods — which constrain the policy representation to be inherently interpretable at the cost of some performance. Post-hoc methods applicable to RL include saliency-based input attribution, SHAP (SHapley Additive exPlanations), LIME (Local Interpretable Model-agnostic Explanations), and attention mechanism visualisation. Intrinsic methods include policy tree extraction, linear function approximation, and Bayesian program synthesis for policy representation.</w:t>
+      </w:r>
+    </w:p>
+    <w:p>
+      <w:pPr>
+        <w:pStyle w:val="Heading2"/>
         <w:spacing w:after="160" w:before="320"/>
       </w:pPr>
       <w:r>
@@ -10057,6 +10083,7 @@
     </w:p>
     <w:p>
       <w:pPr>
+        <w:pStyle w:val="Heading3"/>
         <w:spacing w:after="100" w:before="200"/>
       </w:pPr>
       <w:r>
@@ -10095,7 +10122,7 @@
           <w:sz w:val="24"/>
           <w:szCs w:val="24"/>
         </w:rPr>
-        <w:t xml:space="preserve">The experimental evaluation of the proposed framework was conducted on multi-robot coordination scenarios and demonstrated significant improvements in coordination efficiency and learning stability compared to conventional MARL baselines. The task completion rate achieved by the hierarchical approach was markedly higher, particularly in scenarios characterized by dynamic task reassignment and agent competition for shared resources. The framework also demonstrated improved convergence speed, reaching stable coordination policies in fewer training episodes than flat MARL counterparts.</w:t>
+        <w:t xml:space="preserve">The experimental evaluation of the proposed framework was conducted on multi-robot coordination scenarios and demonstrated significant improvements in coordination efficiency and learning stability compared to conventional MARL baselines. The task completion rate achieved by the hierarchical approach was markedly higher, particularly in scenarios characterised by dynamic task reassignment and agent competition for shared resources. The framework also demonstrated improved convergence speed, reaching stable coordination policies in fewer training episodes than flat MARL counterparts.</w:t>
       </w:r>
     </w:p>
     <w:p>
@@ -10114,6 +10141,7 @@
     </w:p>
     <w:p>
       <w:pPr>
+        <w:pStyle w:val="Heading3"/>
         <w:spacing w:after="100" w:before="200"/>
       </w:pPr>
       <w:r>
@@ -10138,7 +10166,7 @@
           <w:sz w:val="24"/>
           <w:szCs w:val="24"/>
         </w:rPr>
-        <w:t xml:space="preserve">Li et al. (2025) introduced a coordination strategy for multi-agent reinforcement learning based on dual collaborative constraints, published in Neural Networks. The approach reformulates the MARL training objective as a constrained optimization problem in which two categories of collaborative constraints — behavioral constraints that regulate the diversity of agent actions and consensus constraints that promote agreement on shared coordination strategies — are simultaneously optimized alongside the primary reward maximization objective. The dual constraint formulation is designed to strike a balance between exploration diversity and coordination coherence during the learning process.</w:t>
+        <w:t xml:space="preserve">Li et al. (2025) introduced a coordination strategy for multi-agent reinforcement learning based on dual collaborative constraints, published in Neural Networks. The approach reformulates the MARL training objective as a constrained optimisation problem in which two categories of collaborative constraints — behavioural constraints that regulate the diversity of agent actions and consensus constraints that promote agreement on shared coordination strategies — are simultaneously optimised alongside the primary reward maximization objective. The dual constraint formulation is designed to strike a balance between exploration diversity and coordination coherence during the learning process.</w:t>
       </w:r>
     </w:p>
     <w:p>
@@ -10152,7 +10180,7 @@
           <w:sz w:val="24"/>
           <w:szCs w:val="24"/>
         </w:rPr>
-        <w:t xml:space="preserve">The experimental results demonstrate that the dual-constraint approach achieves substantially improved coordination accuracy and convergence speed compared to unconstrained MARL baselines on benchmark cooperative tasks. The behavioral constraints effectively prevent premature convergence to suboptimal coordination strategies by maintaining sufficient policy diversity during early training phases, while the consensus constraints progressively steer the agent population toward coherent and efficient coordination behaviors as training progresses. The approach represents a principled contribution to the challenge of coordinating the learning dynamics of multiple simultaneously optimizing agents.</w:t>
+        <w:t xml:space="preserve">The experimental results demonstrate that the dual-constraint approach achieves substantially improved coordination accuracy and convergence speed compared to unconstrained MARL baselines on benchmark cooperative tasks. The behavioural constraints effectively prevent premature convergence to suboptimal coordination strategies by maintaining sufficient policy diversity during early training phases, while the consensus constraints progressively steer the agent population toward coherent and efficient coordination behaviours as training progresses. The approach represents a principled contribution to the challenge of coordinating the learning dynamics of multiple simultaneously optimising agents.</w:t>
       </w:r>
     </w:p>
     <w:p>
@@ -10166,11 +10194,12 @@
           <w:sz w:val="24"/>
           <w:szCs w:val="24"/>
         </w:rPr>
-        <w:t xml:space="preserve">Despite its contributions to coordination learning efficiency, the framework retains the fundamental black-box opacity characteristic of neural network MARL policies. The constraint formulation does not provide mechanisms for interpreting the learned coordination strategies, and the centralized training approach introduces scalability concerns for large agent populations. The restriction to centralized training environments may also limit the applicability of the approach to truly distributed autonomous systems where global state information is not available during training.</w:t>
-      </w:r>
-    </w:p>
-    <w:p>
-      <w:pPr>
+        <w:t xml:space="preserve">Despite its contributions to coordination learning efficiency, the framework retains the fundamental black-box opacity characteristic of neural network MARL policies. The constraint formulation does not provide mechanisms for interpreting the learned coordination strategies, and the centralised training approach introduces scalability concerns for large agent populations. The restriction to centralised training environments may also limit the applicability of the approach to truly distributed autonomous systems where global state information is not available during training.</w:t>
+      </w:r>
+    </w:p>
+    <w:p>
+      <w:pPr>
+        <w:pStyle w:val="Heading3"/>
         <w:spacing w:after="100" w:before="200"/>
       </w:pPr>
       <w:r>
@@ -10228,6 +10257,7 @@
     </w:p>
     <w:p>
       <w:pPr>
+        <w:pStyle w:val="Heading3"/>
         <w:spacing w:after="100" w:before="200"/>
       </w:pPr>
       <w:r>
@@ -10252,7 +10282,7 @@
           <w:sz w:val="24"/>
           <w:szCs w:val="24"/>
         </w:rPr>
-        <w:t xml:space="preserve">Li et al. (2024) formulated multi-agent coordination as a probabilistic inference problem, presenting a framework in which the optimal joint coordination policy is derived as the solution to a variational inference problem over a generative model of agent interactions. The framework recasts the joint reward maximization objective of MARL as an inference problem in which agents maintain probabilistic beliefs over the policies of other agents and use these beliefs to inform their own policy selections. The variational inference formulation enables the derivation of principled update rules for both the agent policies and the inter-agent belief models within a unified optimization framework.</w:t>
+        <w:t xml:space="preserve">Li et al. (2024) formulated multi-agent coordination as a probabilistic inference problem, presenting a framework in which the optimal joint coordination policy is derived as the solution to a variational inference problem over a generative model of agent interactions. The framework recasts the joint reward maximization objective of MARL as an inference problem in which agents maintain probabilistic beliefs over the policies of other agents and use these beliefs to inform their own policy selections. The variational inference formulation enables the derivation of principled update rules for both the agent policies and the inter-agent belief models within a unified optimisation framework.</w:t>
       </w:r>
     </w:p>
     <w:p>
@@ -10266,7 +10296,7 @@
           <w:sz w:val="24"/>
           <w:szCs w:val="24"/>
         </w:rPr>
-        <w:t xml:space="preserve">The inference-based coordination approach demonstrates strong performance in dynamic environments characterized by complex inter-agent dependencies, as the probabilistic belief model enables each agent to reason explicitly about the potential actions of its peers. The framework achieves superior coordination performance compared to approaches that treat other agents as part of the stationary environment, particularly in scenarios where agent behaviors are strongly interdependent. The variational formulation also provides a natural mechanism for handling partial observability by maintaining uncertainty over the unobserved state components.</w:t>
+        <w:t xml:space="preserve">The inference-based coordination approach demonstrates strong performance in dynamic environments characterised by complex inter-agent dependencies, as the probabilistic belief model enables each agent to reason explicitly about the potential actions of its peers. The framework achieves superior coordination performance compared to approaches that treat other agents as part of the stationary environment, particularly in scenarios where agent behaviours are strongly interdependent. The variational formulation also provides a natural mechanism for handling partial observability by maintaining uncertainty over the unobserved state components.</w:t>
       </w:r>
     </w:p>
     <w:p>
@@ -10285,6 +10315,7 @@
     </w:p>
     <w:p>
       <w:pPr>
+        <w:pStyle w:val="Heading3"/>
         <w:spacing w:after="100" w:before="200"/>
       </w:pPr>
       <w:r>
@@ -10295,7 +10326,7 @@
           <w:sz w:val="24"/>
           <w:szCs w:val="24"/>
         </w:rPr>
-        <w:t xml:space="preserve">Paper 5: Hierarchical Reinforcement Learning with Opponent Modeling for Command and Control</w:t>
+        <w:t xml:space="preserve">Paper 5: Hierarchical Reinforcement Learning with Opponent Modelling for Command and Control</w:t>
       </w:r>
     </w:p>
     <w:p>
@@ -10309,7 +10340,7 @@
           <w:sz w:val="24"/>
           <w:szCs w:val="24"/>
         </w:rPr>
-        <w:t xml:space="preserve">Li et al. (2026) proposed a hierarchical reinforcement learning framework augmented with opponent modeling for strategic decision-making in command and control systems. The framework employs a hierarchical policy structure to enable agents to reason at multiple levels of strategic abstraction, from high-level campaign objectives to tactical maneuver decisions. The opponent modeling component enables agents to maintain and update probabilistic models of adversarial agent behaviors, which inform the selection of strategic responses at the high-level policy layer.</w:t>
+        <w:t xml:space="preserve">Li et al. (2026) proposed a hierarchical reinforcement learning framework augmented with opponent modelling for strategic decision-making in command and control systems. The framework employs a hierarchical policy structure to enable agents to reason at multiple levels of strategic abstraction, from high-level campaign objectives to tactical maneuver decisions. The opponent modelling component enables agents to maintain and update probabilistic models of adversarial agent behaviours, which inform the selection of strategic responses at the high-level policy layer.</w:t>
       </w:r>
     </w:p>
     <w:p>
@@ -10323,7 +10354,7 @@
           <w:sz w:val="24"/>
           <w:szCs w:val="24"/>
         </w:rPr>
-        <w:t xml:space="preserve">The integration of opponent modeling within the hierarchical architecture enables the agents to anticipate and counter adversarial coordination strategies more effectively than non-hierarchical or non-modeling baselines. The experimental evaluation on simulated command and control scenarios demonstrates improved strategic decision-making performance and adaptability to changing adversarial behaviors. The hierarchical structure also facilitates efficient credit assignment by decomposing the overall system reward into sub-rewards associated with individual levels of the policy hierarchy.</w:t>
+        <w:t xml:space="preserve">The integration of opponent modelling within the hierarchical architecture enables the agents to anticipate and counter adversarial coordination strategies more effectively than non-hierarchical or non-modelling baselines. The experimental evaluation on simulated command and control scenarios demonstrates improved strategic decision-making performance and adaptability to changing adversarial behaviours. The hierarchical structure also facilitates efficient credit assignment by decomposing the overall system reward into sub-rewards associated with individual levels of the policy hierarchy.</w:t>
       </w:r>
     </w:p>
     <w:p>
@@ -10337,11 +10368,12 @@
           <w:sz w:val="24"/>
           <w:szCs w:val="24"/>
         </w:rPr>
-        <w:t xml:space="preserve">The framework is primarily designed for adversarial multi-agent scenarios, and its applicability to fully cooperative coordination settings is not evaluated. The opponent modeling component introduces additional computational overhead and requires careful specification of the opponent model architecture to avoid model misspecification errors. The framework does not provide explainability mechanisms, limiting its applicability to scenarios where decision transparency is required.</w:t>
-      </w:r>
-    </w:p>
-    <w:p>
-      <w:pPr>
+        <w:t xml:space="preserve">The framework is primarily designed for adversarial multi-agent scenarios, and its applicability to fully cooperative coordination settings is not evaluated. The opponent modelling component introduces additional computational overhead and requires careful specification of the opponent model architecture to avoid model misspecification errors. The framework does not provide explainability mechanisms, limiting its applicability to scenarios where decision transparency is required.</w:t>
+      </w:r>
+    </w:p>
+    <w:p>
+      <w:pPr>
+        <w:pStyle w:val="Heading3"/>
         <w:spacing w:after="100" w:before="200"/>
       </w:pPr>
       <w:r>
@@ -10366,7 +10398,7 @@
           <w:sz w:val="24"/>
           <w:szCs w:val="24"/>
         </w:rPr>
-        <w:t xml:space="preserve">Huang et al. (2023) developed a cooperative hierarchical deep reinforcement learning approach for solving distributed job shop scheduling problems with random job arrivals, published in Computers and Industrial Engineering. The framework decomposes the scheduling problem into hierarchical decision levels: a high-level policy responsible for routing incoming jobs to appropriate workstations and agents, and low-level policies responsible for optimizing the processing sequences of jobs within each workstation. The hierarchical decomposition enables the system to handle the combinatorial complexity of distributed scheduling while adapting in real-time to dynamic job arrival patterns.</w:t>
+        <w:t xml:space="preserve">Huang et al. (2023) developed a cooperative hierarchical deep reinforcement learning approach for solving distributed job shop scheduling problems with random job arrivals, published in Computers and Industrial Engineering. The framework decomposes the scheduling problem into hierarchical decision levels: a high-level policy responsible for routing incoming jobs to appropriate workstations and agents, and low-level policies responsible for optimising the processing sequences of jobs within each workstation. The hierarchical decomposition enables the system to handle the combinatorial complexity of distributed scheduling while adapting in real-time to dynamic job arrival patterns.</w:t>
       </w:r>
     </w:p>
     <w:p>
@@ -10380,7 +10412,7 @@
           <w:sz w:val="24"/>
           <w:szCs w:val="24"/>
         </w:rPr>
-        <w:t xml:space="preserve">The experimental evaluation demonstrates that the cooperative HRL approach achieves significantly improved scheduling performance compared to conventional operations research approaches and flat deep reinforcement learning methods, particularly in scenarios characterized by high variability in job arrival rates and processing requirements. The cooperative learning protocol enables agents to share experience and coordinate their scheduling decisions to minimize global makespan and maximize resource utilization across the distributed manufacturing system.</w:t>
+        <w:t xml:space="preserve">The experimental evaluation demonstrates that the cooperative HRL approach achieves significantly improved scheduling performance compared to conventional operations research approaches and flat deep reinforcement learning methods, particularly in scenarios characterised by high variability in job arrival rates and processing requirements. The cooperative learning protocol enables agents to share experience and coordinate their scheduling decisions to minimise global makespan and maximize resource utilization across the distributed manufacturing system.</w:t>
       </w:r>
     </w:p>
     <w:p>
@@ -10399,6 +10431,7 @@
     </w:p>
     <w:p>
       <w:pPr>
+        <w:pStyle w:val="Heading3"/>
         <w:spacing w:after="100" w:before="200"/>
       </w:pPr>
       <w:r>
@@ -10423,7 +10456,7 @@
           <w:sz w:val="24"/>
           <w:szCs w:val="24"/>
         </w:rPr>
-        <w:t xml:space="preserve">Feng et al. (2024) presented a hierarchical consensus-based MARL framework for multi-robot cooperation tasks, published at the IEEE/RSJ International Conference on Intelligent Robots and Systems. The framework incorporates a consensus mechanism at the high-level policy layer to enable agents to reach agreement on shared coordination strategies through iterative communication and negotiation protocols. The consensus process produces a shared macro-action assignment that guides the low-level behavior of individual agents toward collectively optimal task outcomes.</w:t>
+        <w:t xml:space="preserve">Feng et al. (2024) presented a hierarchical consensus-based MARL framework for multi-robot cooperation tasks, published at the IEEE/RSJ International Conference on Intelligent Robots and Systems. The framework incorporates a consensus mechanism at the high-level policy layer to enable agents to reach agreement on shared coordination strategies through iterative communication and negotiation protocols. The consensus process produces a shared macro-action assignment that guides the low-level behaviour of individual agents toward collectively optimal task outcomes.</w:t>
       </w:r>
     </w:p>
     <w:p>
@@ -10437,7 +10470,7 @@
           <w:sz w:val="24"/>
           <w:szCs w:val="24"/>
         </w:rPr>
-        <w:t xml:space="preserve">The consensus-based coordination approach demonstrates improved task performance and scalability compared to fully decentralized MARL approaches, as the structured agreement process reduces the occurrence of conflicting agent behaviors and promotes more efficient utilization of agent capabilities. The experimental evaluation on multi-robot cooperation benchmarks confirms the effectiveness of the consensus mechanism in both static and dynamic task assignment scenarios.</w:t>
+        <w:t xml:space="preserve">The consensus-based coordination approach demonstrates improved task performance and scalability compared to fully decentralised MARL approaches, as the structured agreement process reduces the occurrence of conflicting agent behaviours and promotes more efficient utilization of agent capabilities. The experimental evaluation on multi-robot cooperation benchmarks confirms the effectiveness of the consensus mechanism in both static and dynamic task assignment scenarios.</w:t>
       </w:r>
     </w:p>
     <w:p>
@@ -10456,6 +10489,7 @@
     </w:p>
     <w:p>
       <w:pPr>
+        <w:pStyle w:val="Heading3"/>
         <w:spacing w:after="100" w:before="200"/>
       </w:pPr>
       <w:r>
@@ -10499,6 +10533,7 @@
     </w:p>
     <w:p>
       <w:pPr>
+        <w:pStyle w:val="Heading3"/>
         <w:spacing w:after="100" w:before="200"/>
       </w:pPr>
       <w:r>
@@ -10542,6 +10577,7 @@
     </w:p>
     <w:p>
       <w:pPr>
+        <w:pStyle w:val="Heading3"/>
         <w:spacing w:after="100" w:before="200"/>
       </w:pPr>
       <w:r>
@@ -10580,11 +10616,12 @@
           <w:sz w:val="24"/>
           <w:szCs w:val="24"/>
         </w:rPr>
-        <w:t xml:space="preserve">The analysis of search and rescue scenarios highlights the acute need for coordination transparency in life-critical autonomous systems. Operators coordinating with robotic swarms in disaster response contexts must be able to understand and predict swarm behavior to effectively integrate autonomous capabilities with human decision-making. This paper directly motivates the development of explainable coordination mechanisms capable of providing actionable intelligence to human operators in real-time operational contexts.</w:t>
-      </w:r>
-    </w:p>
-    <w:p>
-      <w:pPr>
+        <w:t xml:space="preserve">The analysis of search and rescue scenarios highlights the acute need for coordination transparency in life-critical autonomous systems. Operators coordinating with robotic swarms in disaster response contexts must be able to understand and predict swarm behaviour to effectively integrate autonomous capabilities with human decision-making. This paper directly motivates the development of explainable coordination mechanisms capable of providing actionable intelligence to human operators in real-time operational contexts.</w:t>
+      </w:r>
+    </w:p>
+    <w:p>
+      <w:pPr>
+        <w:pStyle w:val="Heading3"/>
         <w:spacing w:after="100" w:before="200"/>
       </w:pPr>
       <w:r>
@@ -10628,6 +10665,7 @@
     </w:p>
     <w:p>
       <w:pPr>
+        <w:pStyle w:val="Heading3"/>
         <w:spacing w:after="100" w:before="200"/>
       </w:pPr>
       <w:r>
@@ -10671,6 +10709,7 @@
     </w:p>
     <w:p>
       <w:pPr>
+        <w:pStyle w:val="Heading3"/>
         <w:spacing w:after="100" w:before="200"/>
       </w:pPr>
       <w:r>
@@ -10714,6 +10753,7 @@
     </w:p>
     <w:p>
       <w:pPr>
+        <w:pStyle w:val="Heading3"/>
         <w:spacing w:after="100" w:before="200"/>
       </w:pPr>
       <w:r>
@@ -10738,7 +10778,7 @@
           <w:sz w:val="24"/>
           <w:szCs w:val="24"/>
         </w:rPr>
-        <w:t xml:space="preserve">Martinez-Gil, Lozano, and Fernandez (2014) developed MARL-Ped, a multi-agent reinforcement learning framework for simulating the collective behavior of pedestrian groups, published in Simulation Modelling Practice and Theory. The framework models each pedestrian as an independent learning agent operating within a shared urban environment and uses reinforcement learning to capture the emergent coordination behaviors characteristic of pedestrian crowds, including lane formation, bottleneck navigation, and collective avoidance of obstacles.</w:t>
+        <w:t xml:space="preserve">Martinez-Gil, Lozano, and Fernandez (2014) developed MARL-Ped, a multi-agent reinforcement learning framework for simulating the collective behaviour of pedestrian groups, published in Simulation Modelling Practice and Theory. The framework models each pedestrian as an independent learning agent operating within a shared urban environment and uses reinforcement learning to capture the emergent coordination behaviours characteristic of pedestrian crowds, including lane formation, bottleneck navigation, and collective avoidance of obstacles.</w:t>
       </w:r>
     </w:p>
     <w:p>
@@ -10752,11 +10792,12 @@
           <w:sz w:val="24"/>
           <w:szCs w:val="24"/>
         </w:rPr>
-        <w:t xml:space="preserve">MARL-Ped demonstrates the broad applicability of multi-agent reinforcement learning to coordination scenarios beyond conventional robotics and computing domains. The simulation results closely reproduce empirical observations of real pedestrian crowd behavior, validating the effectiveness of the MARL framework for modeling complex emergent coordination dynamics. This work contributes to the broader evidence base for the utility of MARL in diverse coordination contexts.</w:t>
-      </w:r>
-    </w:p>
-    <w:p>
-      <w:pPr>
+        <w:t xml:space="preserve">MARL-Ped demonstrates the broad applicability of multi-agent reinforcement learning to coordination scenarios beyond conventional robotics and computing domains. The simulation results closely reproduce empirical observations of real pedestrian crowd behaviour, validating the effectiveness of the MARL framework for modelling complex emergent coordination dynamics. This work contributes to the broader evidence base for the utility of MARL in diverse coordination contexts.</w:t>
+      </w:r>
+    </w:p>
+    <w:p>
+      <w:pPr>
+        <w:pStyle w:val="Heading3"/>
         <w:spacing w:after="100" w:before="200"/>
       </w:pPr>
       <w:r>
@@ -10767,7 +10808,7 @@
           <w:sz w:val="24"/>
           <w:szCs w:val="24"/>
         </w:rPr>
-        <w:t xml:space="preserve">Paper 15: Unpredictable Intelligence — Emergent Behaviors in Autonomous Agents</w:t>
+        <w:t xml:space="preserve">Paper 15: Unpredictable Intelligence — Emergent Behaviours in Autonomous Agents</w:t>
       </w:r>
     </w:p>
     <w:p>
@@ -10781,7 +10822,7 @@
           <w:sz w:val="24"/>
           <w:szCs w:val="24"/>
         </w:rPr>
-        <w:t xml:space="preserve">Abbas and Rasool (2025) examined the phenomenon of emergent and unpredictable behaviors in autonomous agents driven by reinforcement learning dynamics. The paper analyzes the conditions under which RL-trained agents develop coordination strategies that deviate from designer intentions, including specification gaming, reward hacking, and adversarial exploitation of environment affordances. The analysis identifies the opacity of neural network policies as a primary enabler of these unintended emergent behaviors, as it prevents system designers from detecting and correcting misaligned strategies before deployment.</w:t>
+        <w:t xml:space="preserve">Abbas and Rasool (2025) examined the phenomenon of emergent and unpredictable behaviours in autonomous agents driven by reinforcement learning dynamics. The paper analyses the conditions under which RL-trained agents develop coordination strategies that deviate from designer intentions, including specification gaming, reward hacking, and adversarial exploitation of environment affordances. The analysis identifies the opacity of neural network policies as a primary enabler of these unintended emergent behaviours, as it prevents system designers from detecting and correcting misaligned strategies before deployment.</w:t>
       </w:r>
     </w:p>
     <w:p>
@@ -10795,11 +10836,12 @@
           <w:sz w:val="24"/>
           <w:szCs w:val="24"/>
         </w:rPr>
-        <w:t xml:space="preserve">This work provides direct and compelling motivation for the integration of explainability mechanisms into multi-agent reinforcement learning frameworks. The documented cases of emergent behavioral anomalies in RL-trained agents underscore the practical importance of maintaining transparency in the policy learning process and providing operators with the capability to audit and understand agent decision-making. The findings of Abbas and Rasool directly support the research rationale for the Explainability Engine component of the proposed framework.</w:t>
-      </w:r>
-    </w:p>
-    <w:p>
-      <w:pPr>
+        <w:t xml:space="preserve">This work provides direct and compelling motivation for the integration of explainability mechanisms into multi-agent reinforcement learning frameworks. The documented cases of emergent behavioural anomalies in RL-trained agents underscore the practical importance of maintaining transparency in the policy learning process and providing operators with the capability to audit and understand agent decision-making. The findings of Abbas and Rasool directly support the research rationale for the Explainability Engine component of the proposed framework.</w:t>
+      </w:r>
+    </w:p>
+    <w:p>
+      <w:pPr>
+        <w:pStyle w:val="Heading2"/>
         <w:spacing w:after="160" w:before="320"/>
       </w:pPr>
       <w:r>
@@ -11461,7 +11503,7 @@
                 <w:sz w:val="24"/>
                 <w:szCs w:val="24"/>
               </w:rPr>
-              <w:t xml:space="preserve">Dual collaborative constraint optimization</w:t>
+              <w:t xml:space="preserve">Dual collaborative constraint optimisation</w:t>
             </w:r>
           </w:p>
         </w:tc>
@@ -12061,7 +12103,7 @@
                 <w:sz w:val="24"/>
                 <w:szCs w:val="24"/>
               </w:rPr>
-              <w:t xml:space="preserve">Opponent modeling in C2 systems</w:t>
+              <w:t xml:space="preserve">Opponent modelling in C2 systems</w:t>
             </w:r>
           </w:p>
         </w:tc>
@@ -14061,7 +14103,7 @@
                 <w:sz w:val="24"/>
                 <w:szCs w:val="24"/>
               </w:rPr>
-              <w:t xml:space="preserve">Emergent RL agent behaviors</w:t>
+              <w:t xml:space="preserve">Emergent RL agent behaviours</w:t>
             </w:r>
           </w:p>
         </w:tc>
@@ -14343,6 +14385,7 @@
     </w:p>
     <w:p>
       <w:pPr>
+        <w:pStyle w:val="Heading2"/>
         <w:spacing w:after="160" w:before="320"/>
       </w:pPr>
       <w:r>
@@ -14409,11 +14452,12 @@
           <w:sz w:val="24"/>
           <w:szCs w:val="24"/>
         </w:rPr>
-        <w:t xml:space="preserve">Finally, many existing MARL approaches rely on centralized training protocols that require global state information and centralized coordination infrastructure during training. While the CTDE paradigm addresses the deployment-time decentralization requirement, the training-time centralization assumption may be impractical in large-scale real-world deployments where centralized coordination infrastructure is unavailable or prohibitively expensive.</w:t>
-      </w:r>
-    </w:p>
-    <w:p>
-      <w:pPr>
+        <w:t xml:space="preserve">Finally, many existing MARL approaches rely on centralised training protocols that require global state information and centralised coordination infrastructure during training. While the CTDE paradigm addresses the deployment-time decentralization requirement, the training-time centralization assumption may be impractical in large-scale real-world deployments where centralised coordination infrastructure is unavailable or prohibitively expensive.</w:t>
+      </w:r>
+    </w:p>
+    <w:p>
+      <w:pPr>
+        <w:pStyle w:val="Heading2"/>
         <w:spacing w:after="160" w:before="320"/>
       </w:pPr>
       <w:r>
@@ -14452,7 +14496,7 @@
           <w:sz w:val="24"/>
           <w:szCs w:val="24"/>
         </w:rPr>
-        <w:t xml:space="preserve">Specifically, the gap manifests in three dimensions. First, there is a gap in the theoretical integration of explainability mechanisms within hierarchical multi-agent reinforcement learning frameworks, as the interaction between hierarchical policy structures and explanation generation processes has not been formally analyzed or empirically characterized. Second, there is a gap in empirical validation, as no existing work provides a comprehensive benchmarking of an explainable hierarchical MARL framework against multiple baseline approaches across a standardized set of coordination metrics. Third, there is a gap in practical applicability, as the lack of embedded explainability in existing MARL and HRL frameworks prevents their deployment in regulated autonomous system applications where decision transparency is a mandatory requirement.</w:t>
+        <w:t xml:space="preserve">Specifically, the gap manifests in three dimensions. First, there is a gap in the theoretical integration of explainability mechanisms within hierarchical multi-agent reinforcement learning frameworks, as the interaction between hierarchical policy structures and explanation generation processes has not been formally analysed or empirically characterised. Second, there is a gap in empirical validation, as no existing work provides a comprehensive benchmarking of an explainable hierarchical MARL framework against multiple baseline approaches across a standardised set of coordination metrics. Third, there is a gap in practical applicability, as the lack of embedded explainability in existing MARL and HRL frameworks prevents their deployment in regulated autonomous system applications where decision transparency is a mandatory requirement.</w:t>
       </w:r>
     </w:p>
     <w:p>
@@ -14471,6 +14515,7 @@
     </w:p>
     <w:p>
       <w:pPr>
+        <w:pStyle w:val="Heading2"/>
         <w:spacing w:after="160" w:before="320"/>
       </w:pPr>
       <w:r>
@@ -14508,6 +14553,7 @@
     </w:p>
     <w:p>
       <w:pPr>
+        <w:pStyle w:val="Heading1"/>
         <w:spacing w:after="400" w:before="200"/>
         <w:jc w:val="center"/>
       </w:pPr>
@@ -14542,6 +14588,7 @@
     </w:p>
     <w:p>
       <w:pPr>
+        <w:pStyle w:val="Heading2"/>
         <w:spacing w:after="160" w:before="320"/>
       </w:pPr>
       <w:r>
@@ -14571,6 +14618,7 @@
     </w:p>
     <w:p>
       <w:pPr>
+        <w:pStyle w:val="Heading2"/>
         <w:spacing w:after="160" w:before="320"/>
       </w:pPr>
       <w:r>
@@ -14595,7 +14643,7 @@
           <w:sz w:val="24"/>
           <w:szCs w:val="24"/>
         </w:rPr>
-        <w:t xml:space="preserve">The EMAAI-HRL framework is conceived as an end-to-end autonomous coordination system in which multiple intelligent agents learn to coordinate their behaviors in a shared environment through hierarchical reinforcement learning, while simultaneously generating interpretable explanations of their decision-making processes through an embedded explainability engine. The framework is designed to be applicable to a broad class of cooperative multi-agent coordination problems characterized by shared task objectives, partial observability of the environment, and a requirement for transparent and auditable agent behavior.</w:t>
+        <w:t xml:space="preserve">The EMAAI-HRL framework is conceived as an end-to-end autonomous coordination system in which multiple intelligent agents learn to coordinate their behaviours in a shared environment through hierarchical reinforcement learning, while simultaneously generating interpretable explanations of their decision-making processes through an embedded explainability engine. The framework is designed to be applicable to a broad class of cooperative multi-agent coordination problems characterised by shared task objectives, partial observability of the environment, and a requirement for transparent and auditable agent behaviour.</w:t>
       </w:r>
     </w:p>
     <w:p>
@@ -14609,7 +14657,7 @@
           <w:sz w:val="24"/>
           <w:szCs w:val="24"/>
         </w:rPr>
-        <w:t xml:space="preserve">The system operates in an episodic training paradigm in which multiple agents are simultaneously trained within a shared simulation environment. During each training episode, agents observe their local environment states, receive strategic sub-goal assignments from the high-level coordination policy, execute specific actions through the low-level execution policy, and receive reward signals that inform the joint policy update. The explainability engine operates in parallel with the policy evaluation pipeline, continuously generating explanations of agent decisions that can be stored, displayed, and analyzed by system operators.</w:t>
+        <w:t xml:space="preserve">The system operates in an episodic training paradigm in which multiple agents are simultaneously trained within a shared simulation environment. During each training episode, agents observe their local environment states, receive strategic sub-goal assignments from the high-level coordination policy, execute specific actions through the low-level execution policy, and receive reward signals that inform the joint policy update. The explainability engine operates in parallel with the policy evaluation pipeline, continuously generating explanations of agent decisions that can be stored, displayed, and analysed by system operators.</w:t>
       </w:r>
     </w:p>
     <w:p>
@@ -14656,6 +14704,7 @@
     </w:p>
     <w:p>
       <w:pPr>
+        <w:pStyle w:val="Heading2"/>
         <w:spacing w:after="160" w:before="320"/>
       </w:pPr>
       <w:r>
@@ -14680,11 +14729,12 @@
           <w:sz w:val="24"/>
           <w:szCs w:val="24"/>
         </w:rPr>
-        <w:t xml:space="preserve">The operational workflow of the EMAAI-HRL framework can be described through five sequential phases that constitute a single training episode: environment initialization, high-level policy evaluation, low-level policy execution, reward collection and policy update, and explanation generation. These phases execute repeatedly until the episode termination condition is satisfied, generating a complete record of agent behaviors, coordination outcomes, and explanations for each episode.</w:t>
-      </w:r>
-    </w:p>
-    <w:p>
-      <w:pPr>
+        <w:t xml:space="preserve">The operational workflow of the EMAAI-HRL framework can be described through five sequential phases that constitute a single training episode: environment initialisation, high-level policy evaluation, low-level policy execution, reward collection and policy update, and explanation generation. These phases execute repeatedly until the episode termination condition is satisfied, generating a complete record of agent behaviours, coordination outcomes, and explanations for each episode.</w:t>
+      </w:r>
+    </w:p>
+    <w:p>
+      <w:pPr>
+        <w:pStyle w:val="Heading3"/>
         <w:spacing w:after="100" w:before="200"/>
       </w:pPr>
       <w:r>
@@ -14695,7 +14745,7 @@
           <w:sz w:val="24"/>
           <w:szCs w:val="24"/>
         </w:rPr>
-        <w:t xml:space="preserve">Phase 1: Environment Initialization</w:t>
+        <w:t xml:space="preserve">Phase 1: Environment Initialisation</w:t>
       </w:r>
     </w:p>
     <w:p>
@@ -14709,11 +14759,12 @@
           <w:sz w:val="24"/>
           <w:szCs w:val="24"/>
         </w:rPr>
-        <w:t xml:space="preserve">At the beginning of each training episode, the shared multi-agent environment is reset to an initial state drawn from the distribution of starting conditions defined for the coordination task. Each agent receives an initial local observation comprising the observable portion of the environment state within its sensing range. The episode context is initialized, including the task objectives, agent starting positions, and resource configurations. The high-level policy is provided with the global state information available during the CTDE training phase, enabling it to formulate an initial set of sub-goal assignments for each agent based on the initial task configuration.</w:t>
-      </w:r>
-    </w:p>
-    <w:p>
-      <w:pPr>
+        <w:t xml:space="preserve">At the beginning of each training episode, the shared multi-agent environment is reset to an initial state drawn from the distribution of starting conditions defined for the coordination task. Each agent receives an initial local observation comprising the observable portion of the environment state within its sensing range. The episode context is initialised, including the task objectives, agent starting positions, and resource configurations. The high-level policy is provided with the global state information available during the CTDE training phase, enabling it to formulate an initial set of sub-goal assignments for each agent based on the initial task configuration.</w:t>
+      </w:r>
+    </w:p>
+    <w:p>
+      <w:pPr>
+        <w:pStyle w:val="Heading3"/>
         <w:spacing w:after="100" w:before="200"/>
       </w:pPr>
       <w:r>
@@ -14757,6 +14808,7 @@
     </w:p>
     <w:p>
       <w:pPr>
+        <w:pStyle w:val="Heading3"/>
         <w:spacing w:after="100" w:before="200"/>
       </w:pPr>
       <w:r>
@@ -14800,6 +14852,7 @@
     </w:p>
     <w:p>
       <w:pPr>
+        <w:pStyle w:val="Heading3"/>
         <w:spacing w:after="100" w:before="200"/>
       </w:pPr>
       <w:r>
@@ -14838,11 +14891,12 @@
           <w:sz w:val="24"/>
           <w:szCs w:val="24"/>
         </w:rPr>
-        <w:t xml:space="preserve">The policy update procedure employs a hierarchical variant of the Proximal Policy Optimization (PPO) algorithm, which provides stable and sample-efficient policy gradient updates with bounded policy change per update step. The high-level and low-level policies are updated independently, with different learning rates and update frequencies appropriate to their respective temporal scales of operation. Experience replay buffers maintain recent trajectories for mini-batch policy updates, improving sample efficiency and reducing the variance of gradient estimates.</w:t>
-      </w:r>
-    </w:p>
-    <w:p>
-      <w:pPr>
+        <w:t xml:space="preserve">The policy update procedure employs a hierarchical variant of the Proximal Policy Optimisation (PPO) algorithm, which provides stable and sample-efficient policy gradient updates with bounded policy change per update step. The high-level and low-level policies are updated independently, with different learning rates and update frequencies appropriate to their respective temporal scales of operation. Experience replay buffers maintain recent trajectories for mini-batch policy updates, improving sample efficiency and reducing the variance of gradient estimates.</w:t>
+      </w:r>
+    </w:p>
+    <w:p>
+      <w:pPr>
+        <w:pStyle w:val="Heading3"/>
         <w:spacing w:after="100" w:before="200"/>
       </w:pPr>
       <w:r>
@@ -14867,11 +14921,12 @@
           <w:sz w:val="24"/>
           <w:szCs w:val="24"/>
         </w:rPr>
-        <w:t xml:space="preserve">At the conclusion of each episode, the explainability engine compiles the complete record of agent decisions, sub-goal assignments, primitive actions, and reward signals into a structured explanation artifact. The explanation artifact includes the high-level coordination strategy narrative, the per-agent decision timelines with action justifications at each decision point, graphical representations of the coordination patterns observed during the episode, and a quantitative assessment of explanation quality metrics. These explanation artifacts are stored in a persistent logging system that enables retrospective analysis of agent behavior over extended training periods.</w:t>
-      </w:r>
-    </w:p>
-    <w:p>
-      <w:pPr>
+        <w:t xml:space="preserve">At the conclusion of each episode, the explainability engine compiles the complete record of agent decisions, sub-goal assignments, primitive actions, and reward signals into a structured explanation artifact. The explanation artifact includes the high-level coordination strategy narrative, the per-agent decision timelines with action justifications at each decision point, graphical representations of the coordination patterns observed during the episode, and a quantitative assessment of explanation quality metrics. These explanation artifacts are stored in a persistent logging system that enables retrospective analysis of agent behaviour over extended training periods.</w:t>
+      </w:r>
+    </w:p>
+    <w:p>
+      <w:pPr>
+        <w:pStyle w:val="Heading2"/>
         <w:spacing w:after="160" w:before="320"/>
       </w:pPr>
       <w:r>
@@ -14901,6 +14956,7 @@
     </w:p>
     <w:p>
       <w:pPr>
+        <w:pStyle w:val="Heading3"/>
         <w:spacing w:after="100" w:before="200"/>
       </w:pPr>
       <w:r>
@@ -14925,7 +14981,7 @@
           <w:sz w:val="24"/>
           <w:szCs w:val="24"/>
         </w:rPr>
-        <w:t xml:space="preserve">The Multi-Agent Coordination Layer constitutes the lowest tier of the framework architecture and provides the fundamental infrastructure for multi-agent interaction and coordination. This tier encompasses the shared environment interface, through which agents receive local observations and submit action commands; the inter-agent communication bus, which enables agents to share relevant state information and coordination signals; the reward allocation mechanism, which distributes reward signals among agents based on their contributions to the global coordination objective; and the episode management system, which controls the initialization, progression, and termination of training episodes.</w:t>
+        <w:t xml:space="preserve">The Multi-Agent Coordination Layer constitutes the lowest tier of the framework architecture and provides the fundamental infrastructure for multi-agent interaction and coordination. This tier encompasses the shared environment interface, through which agents receive local observations and submit action commands; the inter-agent communication bus, which enables agents to share relevant state information and coordination signals; the reward allocation mechanism, which distributes reward signals among agents based on their contributions to the global coordination objective; and the episode management system, which controls the initialisation, progression, and termination of training episodes.</w:t>
       </w:r>
     </w:p>
     <w:p>
@@ -14944,6 +15000,7 @@
     </w:p>
     <w:p>
       <w:pPr>
+        <w:pStyle w:val="Heading3"/>
         <w:spacing w:after="100" w:before="200"/>
       </w:pPr>
       <w:r>
@@ -14968,7 +15025,7 @@
           <w:sz w:val="24"/>
           <w:szCs w:val="24"/>
         </w:rPr>
-        <w:t xml:space="preserve">The HRL Module constitutes the intelligence tier of the framework, implementing the two-level policy hierarchy through which agents learn to coordinate their behaviors. The high-level policy component of the HRL Module is implemented as a centralized neural network that takes the global state representation as input and produces macro-action assignments for all agents simultaneously. The centralized implementation enables the high-level policy to account for the global coordination context, including the current states and objectives of all agents, when making macro-action assignment decisions.</w:t>
+        <w:t xml:space="preserve">The HRL Module constitutes the intelligence tier of the framework, implementing the two-level policy hierarchy through which agents learn to coordinate their behaviours. The high-level policy component of the HRL Module is implemented as a centralised neural network that takes the global state representation as input and produces macro-action assignments for all agents simultaneously. The centralised implementation enables the high-level policy to account for the global coordination context, including the current states and objectives of all agents, when making macro-action assignment decisions.</w:t>
       </w:r>
     </w:p>
     <w:p>
@@ -14982,11 +15039,12 @@
           <w:sz w:val="24"/>
           <w:szCs w:val="24"/>
         </w:rPr>
-        <w:t xml:space="preserve">The low-level policy components of the HRL Module are implemented as decentralized neural networks, one per agent, that take the individual agent's local observation and current macro-action assignment as input and produce primitive action selections as output. The decentralized implementation enables efficient parallel execution of low-level policy evaluations during both training and deployment. The Q-value approximation networks, used for the temporal difference learning updates of both policy levels, are implemented with the same neural network architecture as the corresponding policy networks, enabling efficient shared computation.</w:t>
-      </w:r>
-    </w:p>
-    <w:p>
-      <w:pPr>
+        <w:t xml:space="preserve">The low-level policy components of the HRL Module are implemented as decentralised neural networks, one per agent, that take the individual agent's local observation and current macro-action assignment as input and produce primitive action selections as output. The decentralised implementation enables efficient parallel execution of low-level policy evaluations during both training and deployment. The Q-value approximation networks, used for the temporal difference learning updates of both policy levels, are implemented with the same neural network architecture as the corresponding policy networks, enabling efficient shared computation.</w:t>
+      </w:r>
+    </w:p>
+    <w:p>
+      <w:pPr>
+        <w:pStyle w:val="Heading3"/>
         <w:spacing w:after="100" w:before="200"/>
       </w:pPr>
       <w:r>
@@ -15011,7 +15069,7 @@
           <w:sz w:val="24"/>
           <w:szCs w:val="24"/>
         </w:rPr>
-        <w:t xml:space="preserve">The Explainability Engine constitutes the transparency tier of the framework and operates in parallel with the HRL Module to provide real-time interpretation of agent decision-making. The engine is structured around three operational components: the Feature Attribution Analyzer, which identifies the most influential features in the state representation that drove each policy decision; the Policy Visualization Generator, which creates graphical representations of the learned policy landscape and agent coordination patterns; and the Decision Trace Logger, which maintains a structured record of all decisions, sub-goal assignments, and reward signals over the course of each training episode.</w:t>
+        <w:t xml:space="preserve">The Explainability Engine constitutes the transparency tier of the framework and operates in parallel with the HRL Module to provide real-time interpretation of agent decision-making. The engine is structured around three operational components: the Feature Attribution Analyser, which identifies the most influential features in the state representation that drove each policy decision; the Policy Visualisation Generator, which creates graphical representations of the learned policy landscape and agent coordination patterns; and the Decision Trace Logger, which maintains a structured record of all decisions, sub-goal assignments, and reward signals over the course of each training episode.</w:t>
       </w:r>
     </w:p>
     <w:p>
@@ -15025,11 +15083,12 @@
           <w:sz w:val="24"/>
           <w:szCs w:val="24"/>
         </w:rPr>
-        <w:t xml:space="preserve">The Feature Attribution Analyzer employs gradient-based attribution techniques applied to the policy network outputs to identify the relative importance of individual state features in determining each macro-action or primitive action selection. The attribution scores are normalized and presented as ranked feature importance lists, enabling operators to immediately identify the dominant factors driving each agent decision. The Policy Visualization Generator employs dimensionality reduction techniques to project the high-dimensional policy space into two-dimensional representations that can be rendered as color-coded heatmaps, trajectory plots, or coordination pattern diagrams.</w:t>
-      </w:r>
-    </w:p>
-    <w:p>
-      <w:pPr>
+        <w:t xml:space="preserve">The Feature Attribution Analyser employs gradient-based attribution techniques applied to the policy network outputs to identify the relative importance of individual state features in determining each macro-action or primitive action selection. The attribution scores are normalized and presented as ranked feature importance lists, enabling operators to immediately identify the dominant factors driving each agent decision. The Policy Visualisation Generator employs dimensionality reduction techniques to project the high-dimensional policy space into two-dimensional representations that can be rendered as colour-coded heatmaps, trajectory plots, or coordination pattern diagrams.</w:t>
+      </w:r>
+    </w:p>
+    <w:p>
+      <w:pPr>
+        <w:pStyle w:val="Heading2"/>
         <w:spacing w:after="160" w:before="320"/>
       </w:pPr>
       <w:r>
@@ -15045,6 +15104,7 @@
     </w:p>
     <w:p>
       <w:pPr>
+        <w:pStyle w:val="Heading3"/>
         <w:spacing w:after="100" w:before="200"/>
       </w:pPr>
       <w:r>
@@ -15111,7 +15171,7 @@
           <w:sz w:val="24"/>
           <w:szCs w:val="24"/>
         </w:rPr>
-        <w:t xml:space="preserve">Reward Allocation Mechanism: The reward allocation mechanism implements a shaped reward function that decomposes the global coordination objective into individual agent contributions. The global reward for successful task completion is supplemented by individual sub-task completion bonuses and coordination efficiency rewards that reflect the quality of inter-agent cooperation during the current episode. The reward shaping is designed to promote cooperative behaviors without creating incentives for individual agents to defect from the cooperative strategy in pursuit of local reward maximization.</w:t>
+        <w:t xml:space="preserve">Reward Allocation Mechanism: The reward allocation mechanism implements a shaped reward function that decomposes the global coordination objective into individual agent contributions. The global reward for successful task completion is supplemented by individual sub-task completion bonuses and coordination efficiency rewards that reflect the quality of inter-agent cooperation during the current episode. The reward shaping is designed to promote cooperative behaviours without creating incentives for individual agents to defect from the cooperative strategy in pursuit of local reward maximization.</w:t>
       </w:r>
     </w:p>
     <w:p>
@@ -15125,11 +15185,12 @@
           <w:sz w:val="24"/>
           <w:szCs w:val="24"/>
         </w:rPr>
-        <w:t xml:space="preserve">Episode Management: The episode management component controls the initialization of each training episode, including the random sampling of initial agent positions, task configurations, and resource placements from the episode parameter distributions. The component also monitors episode progress and triggers the termination condition when the task has been completed, the maximum episode length has been reached, or a catastrophic coordination failure has occurred. Episode statistics, including total reward, task completion rate, and coordination efficiency metrics, are logged at episode conclusion for subsequent performance analysis.</w:t>
-      </w:r>
-    </w:p>
-    <w:p>
-      <w:pPr>
+        <w:t xml:space="preserve">Episode Management: The episode management component controls the initialisation of each training episode, including the random sampling of initial agent positions, task configurations, and resource placements from the episode parameter distributions. The component also monitors episode progress and triggers the termination condition when the task has been completed, the maximum episode length has been reached, or a catastrophic coordination failure has occurred. Episode statistics, including total reward, task completion rate, and coordination efficiency metrics, are logged at episode conclusion for subsequent performance analysis.</w:t>
+      </w:r>
+    </w:p>
+    <w:p>
+      <w:pPr>
+        <w:pStyle w:val="Heading3"/>
         <w:spacing w:after="100" w:before="200"/>
       </w:pPr>
       <w:r>
@@ -15168,7 +15229,7 @@
           <w:sz w:val="24"/>
           <w:szCs w:val="24"/>
         </w:rPr>
-        <w:t xml:space="preserve">High-Level Policy Architecture: The high-level policy is implemented as a centralized actor-critic network with a shared encoder backbone. The encoder processes the global state representation through a stack of fully connected layers with ReLU activation functions, producing a fixed-dimensional hidden state representation. The actor network maps this hidden representation to a categorical distribution over the set of available macro-actions for each agent, while the critic network estimates the expected cumulative reward under the current high-level policy. The centralized architecture enables the high-level policy to account for the joint state of all agents when making macro-action assignments, promoting globally optimal coordination strategies.</w:t>
+        <w:t xml:space="preserve">High-Level Policy Architecture: The high-level policy is implemented as a centralised actor-critic network with a shared encoder backbone. The encoder processes the global state representation through a stack of fully connected layers with ReLU activation functions, producing a fixed-dimensional hidden state representation. The actor network maps this hidden representation to a categorical distribution over the set of available macro-actions for each agent, while the critic network estimates the expected cumulative reward under the current high-level policy. The centralised architecture enables the high-level policy to account for the joint state of all agents when making macro-action assignments, promoting globally optimal coordination strategies.</w:t>
       </w:r>
     </w:p>
     <w:p>
@@ -15196,7 +15257,7 @@
           <w:sz w:val="24"/>
           <w:szCs w:val="24"/>
         </w:rPr>
-        <w:t xml:space="preserve">Low-Level Policy Architecture: Each agent's low-level policy is implemented as an independent actor-critic network conditioned on both the local observation and the current macro-action specification. The conditioning mechanism appends a learned embedding of the macro-action specification to the agent's local observation encoding before passing the combined representation to the actor and critic networks. This conditioning enables the low-level policy to specialize its action selection strategy based on the current strategic objective, implementing a form of goal-conditioned reinforcement learning at the primitive action level.</w:t>
+        <w:t xml:space="preserve">Low-Level Policy Architecture: Each agent's low-level policy is implemented as an independent actor-critic network conditioned on both the local observation and the current macro-action specification. The conditioning mechanism appends a learned embedding of the macro-action specification to the agent's local observation encoding before passing the combined representation to the actor and critic networks. This conditioning enables the low-level policy to specialise its action selection strategy based on the current strategic objective, implementing a form of goal-conditioned reinforcement learning at the primitive action level.</w:t>
       </w:r>
     </w:p>
     <w:p>
@@ -15224,11 +15285,12 @@
           <w:sz w:val="24"/>
           <w:szCs w:val="24"/>
         </w:rPr>
-        <w:t xml:space="preserve">Policy Update Algorithm: Both the high-level and low-level policies are updated using variants of the Proximal Policy Optimization (PPO) algorithm. The PPO update rule constrains the magnitude of policy changes at each update step through a clipped surrogate objective, preventing destabilizing policy updates that could disrupt the coordination behaviors learned in earlier training phases. The high-level policy is updated at a slower rate (every K episodes) compared to the low-level policies (updated every episode), reflecting the different temporal scales of operation at each level of the hierarchy. Generalized Advantage Estimation (GAE) is employed to reduce the variance of the policy gradient estimates at both levels.</w:t>
-      </w:r>
-    </w:p>
-    <w:p>
-      <w:pPr>
+        <w:t xml:space="preserve">Policy Update Algorithm: Both the high-level and low-level policies are updated using variants of the Proximal Policy Optimisation (PPO) algorithm. The PPO update rule constrains the magnitude of policy changes at each update step through a clipped surrogate objective, preventing destabilizing policy updates that could disrupt the coordination behaviours learned in earlier training phases. The high-level policy is updated at a slower rate (every K episodes) compared to the low-level policies (updated every episode), reflecting the different temporal scales of operation at each level of the hierarchy. Generalised Advantage Estimation (GAE) is employed to reduce the variance of the policy gradient estimates at both levels.</w:t>
+      </w:r>
+    </w:p>
+    <w:p>
+      <w:pPr>
+        <w:pStyle w:val="Heading3"/>
         <w:spacing w:after="100" w:before="200"/>
       </w:pPr>
       <w:r>
@@ -15295,7 +15357,7 @@
           <w:sz w:val="24"/>
           <w:szCs w:val="24"/>
         </w:rPr>
-        <w:t xml:space="preserve">Policy Visualization Module: The policy visualization module generates graphical representations of the learned coordination policies that enable operators to develop intuitive understanding of agent behavioral strategies. Two primary visualization types are provided: value landscape maps, which display the estimated Q-value function over the state space as a color-coded heatmap, enabling operators to identify regions of high and low strategic value; and coordination flow diagrams, which display the typical movement patterns and interaction sequences of multiple agents as directed graph overlays on the environment map, enabling operators to verify that the learned coordination strategy matches their operational intentions.</w:t>
+        <w:t xml:space="preserve">Policy Visualisation Module: The policy visualisation module generates graphical representations of the learned coordination policies that enable operators to develop intuitive understanding of agent behavioural strategies. Two primary visualisation types are provided: value landscape maps, which display the estimated Q-value function over the state space as a colour-coded heatmap, enabling operators to identify regions of high and low strategic value; and coordination flow diagrams, which display the typical movement patterns and interaction sequences of multiple agents as directed graph overlays on the environment map, enabling operators to verify that the learned coordination strategy matches their operational intentions.</w:t>
       </w:r>
     </w:p>
     <w:p>
@@ -15309,7 +15371,7 @@
           <w:sz w:val="24"/>
           <w:szCs w:val="24"/>
         </w:rPr>
-        <w:t xml:space="preserve">The policy visualization module also provides temporal evolution displays that show how the coordination policy changes over the course of training, enabling practitioners to track the development of cooperation strategies and identify training phases in which beneficial or detrimental coordination patterns emerge. These displays are particularly valuable for diagnosing training instabilities and for validating that the hierarchical policy structure is being exploited as designed.</w:t>
+        <w:t xml:space="preserve">The policy visualisation module also provides temporal evolution displays that show how the coordination policy changes over the course of training, enabling practitioners to track the development of cooperation strategies and identify training phases in which beneficial or detrimental coordination patterns emerge. These displays are particularly valuable for diagnosing training instabilities and for validating that the hierarchical policy structure is being exploited as designed.</w:t>
       </w:r>
     </w:p>
     <w:p>
@@ -15342,6 +15404,7 @@
     </w:p>
     <w:p>
       <w:pPr>
+        <w:pStyle w:val="Heading2"/>
         <w:spacing w:after="160" w:before="320"/>
       </w:pPr>
       <w:r>
@@ -15357,6 +15420,7 @@
     </w:p>
     <w:p>
       <w:pPr>
+        <w:pStyle w:val="Heading3"/>
         <w:spacing w:after="100" w:before="200"/>
       </w:pPr>
       <w:r>
@@ -15409,11 +15473,12 @@
           <w:sz w:val="24"/>
           <w:szCs w:val="24"/>
         </w:rPr>
-        <w:t xml:space="preserve">The reward tensor flows to the policy update component of the HRL Module, where it is combined with the recorded trajectory data to compute policy gradient estimates and update the high-level and low-level policy network parameters. Simultaneously, the policy outputs, state representations, and reward signals flow to the Explainability Engine, which generates action justification artifacts, updates the policy visualization representations, and appends new entries to the decision trace log.</w:t>
-      </w:r>
-    </w:p>
-    <w:p>
-      <w:pPr>
+        <w:t xml:space="preserve">The reward tensor flows to the policy update component of the HRL Module, where it is combined with the recorded trajectory data to compute policy gradient estimates and update the high-level and low-level policy network parameters. Simultaneously, the policy outputs, state representations, and reward signals flow to the Explainability Engine, which generates action justification artifacts, updates the policy visualisation representations, and appends new entries to the decision trace log.</w:t>
+      </w:r>
+    </w:p>
+    <w:p>
+      <w:pPr>
+        <w:pStyle w:val="Heading3"/>
         <w:spacing w:after="100" w:before="200"/>
       </w:pPr>
       <w:r>
@@ -15471,6 +15536,7 @@
     </w:p>
     <w:p>
       <w:pPr>
+        <w:pStyle w:val="Heading2"/>
         <w:spacing w:after="160" w:before="320"/>
       </w:pPr>
       <w:r>
@@ -15486,6 +15552,7 @@
     </w:p>
     <w:p>
       <w:pPr>
+        <w:pStyle w:val="Heading3"/>
         <w:spacing w:after="100" w:before="200"/>
       </w:pPr>
       <w:r>
@@ -16035,6 +16102,7 @@
     </w:p>
     <w:p>
       <w:pPr>
+        <w:pStyle w:val="Heading3"/>
         <w:spacing w:after="100" w:before="200"/>
       </w:pPr>
       <w:r>
@@ -16646,7 +16714,7 @@
           <w:sz w:val="24"/>
           <w:szCs w:val="24"/>
         </w:rPr>
-        <w:t xml:space="preserve">. The high-level policy optimization objective is to maximize the expected cumulative reward with respect to the macro-action assignments:</w:t>
+        <w:t xml:space="preserve">. The high-level policy optimisation objective is to maximize the expected cumulative reward with respect to the macro-action assignments:</w:t>
       </w:r>
     </w:p>
     <w:p>
@@ -16814,6 +16882,7 @@
     </w:p>
     <w:p>
       <w:pPr>
+        <w:pStyle w:val="Heading3"/>
         <w:spacing w:after="100" w:before="200"/>
       </w:pPr>
       <w:r>
@@ -16824,7 +16893,7 @@
           <w:sz w:val="24"/>
           <w:szCs w:val="24"/>
         </w:rPr>
-        <w:t xml:space="preserve">3.7.3 Action-Value Function and Policy Optimization</w:t>
+        <w:t xml:space="preserve">3.7.3 Action-Value Function and Policy Optimisation</w:t>
       </w:r>
     </w:p>
     <w:p>
@@ -17390,7 +17459,7 @@
           <w:sz w:val="24"/>
           <w:szCs w:val="24"/>
         </w:rPr>
-        <w:t xml:space="preserve">). The network parameters are updated by minimizing the mean squared Bellman error loss:</w:t>
+        <w:t xml:space="preserve">). The network parameters are updated by minimising the mean squared Bellman error loss:</w:t>
       </w:r>
     </w:p>
     <w:p>
@@ -17708,6 +17777,7 @@
     </w:p>
     <w:p>
       <w:pPr>
+        <w:pStyle w:val="Heading3"/>
         <w:spacing w:after="100" w:before="200"/>
       </w:pPr>
       <w:r>
@@ -17718,7 +17788,7 @@
           <w:sz w:val="24"/>
           <w:szCs w:val="24"/>
         </w:rPr>
-        <w:t xml:space="preserve">3.7.4 Proximal Policy Optimization Update Rule</w:t>
+        <w:t xml:space="preserve">3.7.4 Proximal Policy Optimisation Update Rule</w:t>
       </w:r>
     </w:p>
     <w:p>
@@ -17732,7 +17802,7 @@
           <w:sz w:val="24"/>
           <w:szCs w:val="24"/>
         </w:rPr>
-        <w:t xml:space="preserve">The policy gradient update employs the Proximal Policy Optimization (PPO) algorithm with clipped surrogate objective. The PPO objective function is defined as:</w:t>
+        <w:t xml:space="preserve">The policy gradient update employs the Proximal Policy Optimisation (PPO) algorithm with clipped surrogate objective. The PPO objective function is defined as:</w:t>
       </w:r>
     </w:p>
     <w:p>
@@ -18243,7 +18313,7 @@
           <w:sz w:val="24"/>
           <w:szCs w:val="24"/>
         </w:rPr>
-        <w:t xml:space="preserve"> is the generalized advantage estimate at time step </w:t>
+        <w:t xml:space="preserve"> is the generalised advantage estimate at time step </w:t>
       </w:r>
       <w:r>
         <w:rPr>
@@ -18279,7 +18349,7 @@
           <w:sz w:val="24"/>
           <w:szCs w:val="24"/>
         </w:rPr>
-        <w:t xml:space="preserve"> is the clipping parameter that bounds the magnitude of policy change per update step. The Generalized Advantage Estimate is computed as:</w:t>
+        <w:t xml:space="preserve"> is the clipping parameter that bounds the magnitude of policy change per update step. The Generalised Advantage Estimate is computed as:</w:t>
       </w:r>
     </w:p>
     <w:p>
@@ -18630,6 +18700,7 @@
     </w:p>
     <w:p>
       <w:pPr>
+        <w:pStyle w:val="Heading3"/>
         <w:spacing w:after="100" w:before="200"/>
       </w:pPr>
       <w:r>
@@ -19190,6 +19261,7 @@
     </w:p>
     <w:p>
       <w:pPr>
+        <w:pStyle w:val="Heading2"/>
         <w:spacing w:after="160" w:before="320"/>
       </w:pPr>
       <w:r>
@@ -19214,7 +19286,7 @@
           <w:sz w:val="24"/>
           <w:szCs w:val="24"/>
         </w:rPr>
-        <w:t xml:space="preserve">The EMAAI-HRL framework is implemented using the following primary technologies and libraries. Python 3.9 serves as the primary programming language, providing a rich ecosystem of scientific computing and machine learning libraries. PyTorch 2.0 is employed for the implementation and training of the neural network policy components, providing automatic differentiation support essential for gradient-based policy optimization and saliency attribution computation. NumPy and SciPy provide the numerical computing foundation for the mathematical operations involved in advantage estimation, reward shaping, and statistical evaluation.</w:t>
+        <w:t xml:space="preserve">The EMAAI-HRL framework is implemented using the following primary technologies and libraries. Python 3.9 serves as the primary programming language, providing a rich ecosystem of scientific computing and machine learning libraries. PyTorch 2.0 is employed for the implementation and training of the neural network policy components, providing automatic differentiation support essential for gradient-based policy optimisation and saliency attribution computation. NumPy and SciPy provide the numerical computing foundation for the mathematical operations involved in advantage estimation, reward shaping, and statistical evaluation.</w:t>
       </w:r>
     </w:p>
     <w:p>
@@ -19228,11 +19300,12 @@
           <w:sz w:val="24"/>
           <w:szCs w:val="24"/>
         </w:rPr>
-        <w:t xml:space="preserve">The OpenAI Gymnasium framework provides the simulation environment interface, enabling the implementation of multi-agent coordination scenarios through its standardized environment API. The PettingZoo library extends Gymnasium to the multi-agent setting, providing a comprehensive set of cooperative and competitive multi-agent environments for training and evaluation benchmarking. Matplotlib and Seaborn are used for the generation of policy visualization outputs and performance evaluation charts. The Weights and Biases platform is employed for experiment tracking, hyperparameter sweep management, and performance metric logging during the training process.</w:t>
-      </w:r>
-    </w:p>
-    <w:p>
-      <w:pPr>
+        <w:t xml:space="preserve">The OpenAI Gymnasium framework provides the simulation environment interface, enabling the implementation of multi-agent coordination scenarios through its standardised environment API. The PettingZoo library extends Gymnasium to the multi-agent setting, providing a comprehensive set of cooperative and competitive multi-agent environments for training and evaluation benchmarking. Matplotlib and Seaborn are used for the generation of policy visualisation outputs and performance evaluation charts. The Weights and Biases platform is employed for experiment tracking, hyperparameter sweep management, and performance metric logging during the training process.</w:t>
+      </w:r>
+    </w:p>
+    <w:p>
+      <w:pPr>
+        <w:pStyle w:val="Heading2"/>
         <w:spacing w:after="160" w:before="320"/>
       </w:pPr>
       <w:r>
@@ -19661,7 +19734,7 @@
                 <w:sz w:val="24"/>
                 <w:szCs w:val="24"/>
               </w:rPr>
-              <w:t xml:space="preserve">Visualization</w:t>
+              <w:t xml:space="preserve">Visualisation</w:t>
             </w:r>
           </w:p>
         </w:tc>
@@ -20332,6 +20405,7 @@
     </w:p>
     <w:p>
       <w:pPr>
+        <w:pStyle w:val="Heading2"/>
         <w:spacing w:after="160" w:before="320"/>
       </w:pPr>
       <w:r>
@@ -20356,7 +20430,7 @@
           <w:sz w:val="24"/>
           <w:szCs w:val="24"/>
         </w:rPr>
-        <w:t xml:space="preserve">This chapter has presented a comprehensive technical description of the Explainable Multi-Agent AI framework with Hierarchical Reinforcement Learning. The system architecture, comprising the Multi-Agent Coordination Layer, the HRL Module, and the Explainability Engine, has been described in detail at both the conceptual and implementation levels. The working principle of the framework has been articulated through a five-phase operational workflow, and the mathematical foundations of the hierarchical policy optimization and explainability attribution have been formally specified. The implementation technologies and hardware requirements complete the description of the proposed system. The following chapter presents the experimental evaluation of the framework, including the setup, datasets, implementation details, and comprehensive performance analysis.</w:t>
+        <w:t xml:space="preserve">This chapter has presented a comprehensive technical description of the Explainable Multi-Agent AI framework with Hierarchical Reinforcement Learning. The system architecture, comprising the Multi-Agent Coordination Layer, the HRL Module, and the Explainability Engine, has been described in detail at both the conceptual and implementation levels. The working principle of the framework has been articulated through a five-phase operational workflow, and the mathematical foundations of the hierarchical policy optimisation and explainability attribution have been formally specified. The implementation technologies and hardware requirements complete the description of the proposed system. The following chapter presents the experimental evaluation of the framework, including the setup, datasets, implementation details, and comprehensive performance analysis.</w:t>
       </w:r>
     </w:p>
     <w:p>
@@ -20369,6 +20443,7 @@
     </w:p>
     <w:p>
       <w:pPr>
+        <w:pStyle w:val="Heading1"/>
         <w:spacing w:after="400" w:before="200"/>
         <w:jc w:val="center"/>
       </w:pPr>
@@ -20403,6 +20478,7 @@
     </w:p>
     <w:p>
       <w:pPr>
+        <w:pStyle w:val="Heading2"/>
         <w:spacing w:after="160" w:before="320"/>
       </w:pPr>
       <w:r>
@@ -20427,11 +20503,12 @@
           <w:sz w:val="24"/>
           <w:szCs w:val="24"/>
         </w:rPr>
-        <w:t xml:space="preserve">This chapter presents the complete implementation of the EMAAI-HRL framework and the results of its experimental evaluation. The chapter begins with a description of the experimental setup, covering the simulation environment configuration, training protocol, and hyperparameter settings. The dataset generation procedure is described, detailing the characteristics of the coordination scenarios used for training and evaluation. The implementation details of the key algorithmic components are then presented, including the network architectures, training procedures, and explanation generation mechanisms. The experimental results are reported through multiple quantitative metrics, analyzed in comparison with baseline approaches, and interpreted in the context of the research objectives. The chapter concludes with a comprehensive discussion of the findings and their implications for the proposed framework's applicability to real-world autonomous system coordination.</w:t>
-      </w:r>
-    </w:p>
-    <w:p>
-      <w:pPr>
+        <w:t xml:space="preserve">This chapter presents the complete implementation of the EMAAI-HRL framework and the results of its experimental evaluation. The chapter begins with a description of the experimental setup, covering the simulation environment configuration, training protocol, and hyperparameter settings. The dataset generation procedure is described, detailing the characteristics of the coordination scenarios used for training and evaluation. The implementation details of the key algorithmic components are then presented, including the network architectures, training procedures, and explanation generation mechanisms. The experimental results are reported through multiple quantitative metrics, analysed in comparison with baseline approaches, and interpreted in the context of the research objectives. The chapter concludes with a comprehensive discussion of the findings and their implications for the proposed framework's applicability to real-world autonomous system coordination.</w:t>
+      </w:r>
+    </w:p>
+    <w:p>
+      <w:pPr>
+        <w:pStyle w:val="Heading2"/>
         <w:spacing w:after="160" w:before="320"/>
       </w:pPr>
       <w:r>
@@ -21508,7 +21585,7 @@
           <w:sz w:val="24"/>
           <w:szCs w:val="24"/>
         </w:rPr>
-        <w:t xml:space="preserve">The baseline comparison experiments employ identical environment configurations and episode budgets, with the following variations: Traditional RL uses a single centralized Q-network without hierarchical structure or multi-agent coordination; MARL employs the MAPPO algorithm with individual decentralized actor networks and a centralized critic, without hierarchical decomposition; HRL employs the hierarchical policy structure without the Explainability Engine. All baseline experiments use the same neural network architecture and learning rate configuration as the proposed framework to ensure fair comparison.</w:t>
+        <w:t xml:space="preserve">The baseline comparison experiments employ identical environment configurations and episode budgets, with the following variations: Traditional RL uses a single centralised Q-network without hierarchical structure or multi-agent coordination; MARL employs the MAPPO algorithm with individual decentralised actor networks and a centralised critic, without hierarchical decomposition; HRL employs the hierarchical policy structure without the Explainability Engine. All baseline experiments use the same neural network architecture and learning rate configuration as the proposed framework to ensure fair comparison.</w:t>
       </w:r>
     </w:p>
     <w:p>
@@ -22266,6 +22343,7 @@
     </w:p>
     <w:p>
       <w:pPr>
+        <w:pStyle w:val="Heading2"/>
         <w:spacing w:after="160" w:before="320"/>
       </w:pPr>
       <w:r>
@@ -22318,7 +22396,7 @@
           <w:sz w:val="24"/>
           <w:szCs w:val="24"/>
         </w:rPr>
-        <w:t xml:space="preserve">The coordination scenarios across all three dataset partitions are drawn from the same parametric distribution, with episode parameter variations including randomized initial agent positions, randomized resource placements, and randomized task site configurations. This randomization ensures that the trained policies are evaluated on a representative sample of the coordination scenario distribution, providing a reliable estimate of generalization performance.</w:t>
+        <w:t xml:space="preserve">The coordination scenarios across all three dataset partitions are drawn from the same parametric distribution, with episode parameter variations including randomized initial agent positions, randomized resource placements, and randomized task site configurations. This randomization ensures that the trained policies are evaluated on a representative sample of the coordination scenario distribution, providing a reliable estimate of generalisation performance.</w:t>
       </w:r>
     </w:p>
     <w:p>
@@ -22332,7 +22410,7 @@
           <w:sz w:val="24"/>
           <w:szCs w:val="24"/>
         </w:rPr>
-        <w:t xml:space="preserve">The target labels for the binary classification metrics (coordinated vs. non-coordinated agent actions) are derived by applying a post-hoc labeling procedure to the recorded episode trajectories. An agent action sequence is labeled as coordinated if it contributes to the successful completion of at least one task during the episode without creating coordination conflicts with peer agents. Action sequences that result in resource contention, task redundancy, or navigation conflicts are labeled as non-coordinated. The labeling procedure is validated through expert review of a representative sample of 100 episodes to ensure consistency and accuracy.</w:t>
+        <w:t xml:space="preserve">The target labels for the binary classification metrics (coordinated vs. non-coordinated agent actions) are derived by applying a post-hoc labelling procedure to the recorded episode trajectories. An agent action sequence is labelled as coordinated if it contributes to the successful completion of at least one task during the episode without creating coordination conflicts with peer agents. Action sequences that result in resource contention, task redundancy, or navigation conflicts are labelled as non-coordinated. The labelling procedure is validated through expert review of a representative sample of 100 episodes to ensure consistency and accuracy.</w:t>
       </w:r>
     </w:p>
     <w:p>
@@ -22346,11 +22424,12 @@
           <w:sz w:val="24"/>
           <w:szCs w:val="24"/>
         </w:rPr>
-        <w:t xml:space="preserve">The synthetic simulation dataset is supplemented by a qualitative analysis of coordination scenarios inspired by three real-world application domains: (1) autonomous warehouse management, in which robot agents must coordinate to fulfill incoming orders by retrieving items from distributed storage locations; (2) multi-drone surveillance coverage, in which UAV agents must coordinate to achieve maximum area coverage while maintaining communication connectivity; and (3) intelligent traffic intersection management, in which vehicle agent coordination must minimize aggregate intersection delay while preventing collision conflicts. While the quantitative evaluation is conducted exclusively on the synthetic simulation dataset, the qualitative analysis serves to motivate and contextualize the research in terms of practical application value.</w:t>
-      </w:r>
-    </w:p>
-    <w:p>
-      <w:pPr>
+        <w:t xml:space="preserve">The synthetic simulation dataset is supplemented by a qualitative analysis of coordination scenarios inspired by three real-world application domains: (1) autonomous warehouse management, in which robot agents must coordinate to fulfill incoming orders by retrieving items from distributed storage locations; (2) multi-drone surveillance coverage, in which UAV agents must coordinate to achieve maximum area coverage while maintaining communication connectivity; and (3) intelligent traffic intersection management, in which vehicle agent coordination must minimise aggregate intersection delay while preventing collision conflicts. While the quantitative evaluation is conducted exclusively on the synthetic simulation dataset, the qualitative analysis serves to motivate and contextualize the research in terms of practical application value.</w:t>
+      </w:r>
+    </w:p>
+    <w:p>
+      <w:pPr>
+        <w:pStyle w:val="Heading2"/>
         <w:spacing w:after="160" w:before="320"/>
       </w:pPr>
       <w:r>
@@ -22592,7 +22671,7 @@
                 <w:sz w:val="24"/>
                 <w:szCs w:val="24"/>
               </w:rPr>
-              <w:t xml:space="preserve">Optimized hierarchical policies {</w:t>
+              <w:t xml:space="preserve">Optimised hierarchical policies {</w:t>
             </w:r>
             <w:r>
               <w:rPr>
@@ -22698,7 +22777,7 @@
                 <w:sz w:val="24"/>
                 <w:szCs w:val="24"/>
               </w:rPr>
-              <w:t xml:space="preserve">Initialize</w:t>
+              <w:t xml:space="preserve">Initialise</w:t>
             </w:r>
             <w:r>
               <w:rPr>
@@ -22741,7 +22820,7 @@
                 <w:sz w:val="24"/>
                 <w:szCs w:val="24"/>
               </w:rPr>
-              <w:t xml:space="preserve">Initialize</w:t>
+              <w:t xml:space="preserve">Initialise</w:t>
             </w:r>
             <w:r>
               <w:rPr>
@@ -22820,7 +22899,7 @@
                 <w:sz w:val="24"/>
                 <w:szCs w:val="24"/>
               </w:rPr>
-              <w:t xml:space="preserve">Initialize</w:t>
+              <w:t xml:space="preserve">Initialise</w:t>
             </w:r>
             <w:r>
               <w:rPr>
@@ -22961,7 +23040,7 @@
                 <w:sz w:val="24"/>
                 <w:szCs w:val="24"/>
               </w:rPr>
-              <w:t xml:space="preserve">Initialize</w:t>
+              <w:t xml:space="preserve">Initialise</w:t>
             </w:r>
             <w:r>
               <w:rPr>
@@ -23022,7 +23101,7 @@
                 <w:sz w:val="24"/>
                 <w:szCs w:val="24"/>
               </w:rPr>
-              <w:t xml:space="preserve">Initialize</w:t>
+              <w:t xml:space="preserve">Initialise</w:t>
             </w:r>
             <w:r>
               <w:rPr>
@@ -25341,11 +25420,12 @@
           <w:sz w:val="24"/>
           <w:szCs w:val="24"/>
         </w:rPr>
-        <w:t xml:space="preserve">The training process is monitored through the Weights and Biases platform, which provides real-time visualization of episode rewards, policy loss curves, coordination success rates, and explainability quality metrics. Early stopping is implemented with a patience parameter of 50 episodes, triggering if the validation coordination success rate does not improve within the patience window. The final model checkpoint is selected based on the highest validation coordination success rate achieved during training.</w:t>
-      </w:r>
-    </w:p>
-    <w:p>
-      <w:pPr>
+        <w:t xml:space="preserve">The training process is monitored through the Weights and Biases platform, which provides real-time visualisation of episode rewards, policy loss curves, coordination success rates, and explainability quality metrics. Early stopping is implemented with a patience parameter of 50 episodes, triggering if the validation coordination success rate does not improve within the patience window. The final model checkpoint is selected based on the highest validation coordination success rate achieved during training.</w:t>
+      </w:r>
+    </w:p>
+    <w:p>
+      <w:pPr>
+        <w:pStyle w:val="Heading2"/>
         <w:spacing w:after="160" w:before="320"/>
       </w:pPr>
       <w:r>
@@ -25361,6 +25441,7 @@
     </w:p>
     <w:p>
       <w:pPr>
+        <w:pStyle w:val="Heading3"/>
         <w:spacing w:after="100" w:before="200"/>
       </w:pPr>
       <w:r>
@@ -25371,7 +25452,7 @@
           <w:sz w:val="24"/>
           <w:szCs w:val="24"/>
         </w:rPr>
-        <w:t xml:space="preserve">4.5.1 Training Environment Visualization</w:t>
+        <w:t xml:space="preserve">4.5.1 Training Environment Visualisation</w:t>
       </w:r>
     </w:p>
     <w:p>
@@ -25385,7 +25466,7 @@
           <w:sz w:val="24"/>
           <w:szCs w:val="24"/>
         </w:rPr>
-        <w:t xml:space="preserve">The simulation training environment is visualized as a 20x20 grid rendered with color-coded cells indicating agent positions (blue markers), resource node locations (green markers), task sites (red markers), and obstacles (dark gray cells). Agent communication links are displayed as dotted lines between agents within communication range. During training, the visualization updates at each episode completion to display the current episode's coordination trajectory as an overlay of agent movement paths.</w:t>
+        <w:t xml:space="preserve">The simulation training environment is visualised as a 20x20 grid rendered with colour-coded cells indicating agent positions (blue markers), resource node locations (green markers), task sites (red markers), and obstacles (dark gray cells). Agent communication links are displayed as dotted lines between agents within communication range. During training, the visualisation updates at each episode completion to display the current episode's coordination trajectory as an overlay of agent movement paths.</w:t>
       </w:r>
     </w:p>
     <w:p>
@@ -25399,11 +25480,12 @@
           <w:sz w:val="24"/>
           <w:szCs w:val="24"/>
         </w:rPr>
-        <w:t xml:space="preserve">The training environment visualization enables real-time inspection of agent coordination behaviors during training, allowing practitioners to identify the emergence of beneficial coordination strategies — such as agent specialization by resource type or geographic zone assignment — as well as problematic behaviors such as agent clustering or task site neglect. Figure 4.1 corresponds to a representative episode snapshot at episode 1000, showing the developed coordination pattern in which agents have naturally organized into two functional groups: resource collection agents operating in the upper half of the grid and task execution agents operating in the lower half.</w:t>
-      </w:r>
-    </w:p>
-    <w:p>
-      <w:pPr>
+        <w:t xml:space="preserve">The training environment visualisation enables real-time inspection of agent coordination behaviours during training, allowing practitioners to identify the emergence of beneficial coordination strategies — such as agent specialisation by resource type or geographic zone assignment — as well as problematic behaviours such as agent clustering or task site neglect. Figure 4.1 corresponds to a representative episode snapshot at episode 1000, showing the developed coordination pattern in which agents have naturally organized into two functional groups: resource collection agents operating in the upper half of the grid and task execution agents operating in the lower half.</w:t>
+      </w:r>
+    </w:p>
+    <w:p>
+      <w:pPr>
+        <w:pStyle w:val="Heading3"/>
         <w:spacing w:after="100" w:before="200"/>
       </w:pPr>
       <w:r>
@@ -25414,7 +25496,7 @@
           <w:sz w:val="24"/>
           <w:szCs w:val="24"/>
         </w:rPr>
-        <w:t xml:space="preserve">4.5.2 Policy Visualization Output</w:t>
+        <w:t xml:space="preserve">4.5.2 Policy Visualisation Output</w:t>
       </w:r>
     </w:p>
     <w:p>
@@ -25428,7 +25510,7 @@
           <w:sz w:val="24"/>
           <w:szCs w:val="24"/>
         </w:rPr>
-        <w:t xml:space="preserve">The policy visualization module generates two primary output types: Q-value heatmaps and coordination flow diagrams. The Q-value heatmap for the high-level policy displays the estimated strategic value of each grid cell for macro-action selection, color-coded from deep blue (low value) through yellow to deep red (high value). At episode 2000, the heatmap clearly shows concentrated high-value regions around the task sites, reflecting the learned understanding that proximity to task completion locations is strategically advantageous.</w:t>
+        <w:t xml:space="preserve">The policy visualisation module generates two primary output types: Q-value heatmaps and coordination flow diagrams. The Q-value heatmap for the high-level policy displays the estimated strategic value of each grid cell for macro-action selection, colour-coded from deep blue (low value) through yellow to deep red (high value). At episode 2000, the heatmap clearly shows concentrated high-value regions around the task sites, reflecting the learned understanding that proximity to task completion locations is strategically advantageous.</w:t>
       </w:r>
     </w:p>
     <w:p>
@@ -25442,11 +25524,12 @@
           <w:sz w:val="24"/>
           <w:szCs w:val="24"/>
         </w:rPr>
-        <w:t xml:space="preserve">The coordination flow diagram displays the aggregate trajectories of all agents over the last 100 episodes as directed arrows overlaid on the grid environment map. The diagram provides an intuitive visualization of the learned coordination patterns, showing the typical routes used by agents to transit between resource nodes and task sites. At episode 2000, the coordination flow diagram reveals the emergence of an efficient two-group coordination strategy consistent with the observations from the training environment visualization.</w:t>
-      </w:r>
-    </w:p>
-    <w:p>
-      <w:pPr>
+        <w:t xml:space="preserve">The coordination flow diagram displays the aggregate trajectories of all agents over the last 100 episodes as directed arrows overlaid on the grid environment map. The diagram provides an intuitive visualisation of the learned coordination patterns, showing the typical routes used by agents to transit between resource nodes and task sites. At episode 2000, the coordination flow diagram reveals the emergence of an efficient two-group coordination strategy consistent with the observations from the training environment visualisation.</w:t>
+      </w:r>
+    </w:p>
+    <w:p>
+      <w:pPr>
+        <w:pStyle w:val="Heading3"/>
         <w:spacing w:after="100" w:before="200"/>
       </w:pPr>
       <w:r>
@@ -25485,11 +25568,12 @@
           <w:sz w:val="24"/>
           <w:szCs w:val="24"/>
         </w:rPr>
-        <w:t xml:space="preserve">A sample low-level primitive action explanation for Agent 5 at episode timestep 248 reads: 'Primitive action: Move East (+1, 0). Explanation: (1) Resource Node 7 is located 3 cells to the East and 1 cell to the North [approach alignment: 0.51]; (2) The cell to the East is unoccupied and traversable [obstacle clearance: 0.32]; (3) Moving East reduces Euclidean distance to Resource Node 7 by 1.0 cells [progress value: 0.17].' These low-level explanations provide step-by-step traceability of agent navigation behavior.</w:t>
-      </w:r>
-    </w:p>
-    <w:p>
-      <w:pPr>
+        <w:t xml:space="preserve">A sample low-level primitive action explanation for Agent 5 at episode timestep 248 reads: 'Primitive action: Move East (+1, 0). Explanation: (1) Resource Node 7 is located 3 cells to the East and 1 cell to the North [approach alignment: 0.51]; (2) The cell to the East is unoccupied and traversable [obstacle clearance: 0.32]; (3) Moving East reduces Euclidean distance to Resource Node 7 by 1.0 cells [progress value: 0.17].' These low-level explanations provide step-by-step traceability of agent navigation behaviour.</w:t>
+      </w:r>
+    </w:p>
+    <w:p>
+      <w:pPr>
+        <w:pStyle w:val="Heading2"/>
         <w:spacing w:after="160" w:before="320"/>
       </w:pPr>
       <w:r>
@@ -25505,6 +25589,7 @@
     </w:p>
     <w:p>
       <w:pPr>
+        <w:pStyle w:val="Heading3"/>
         <w:spacing w:after="100" w:before="200"/>
       </w:pPr>
       <w:r>
@@ -26470,11 +26555,12 @@
           <w:sz w:val="24"/>
           <w:szCs w:val="24"/>
         </w:rPr>
-        <w:t xml:space="preserve">The performance improvement of the proposed framework over the HRL baseline (without explainability) is particularly noteworthy. The 2.3 percentage point accuracy improvement demonstrates that the integration of the explainability engine provides benefits beyond transparency alone — the action justification and policy visualization outputs provide feedback that effectively guides the policy learning process toward more consistent and reliable coordination behaviors. This synergistic effect of explainability on learning performance represents a significant empirical finding that validates the design philosophy of the proposed framework.</w:t>
-      </w:r>
-    </w:p>
-    <w:p>
-      <w:pPr>
+        <w:t xml:space="preserve">The performance improvement of the proposed framework over the HRL baseline (without explainability) is particularly noteworthy. The 2.3 percentage point accuracy improvement demonstrates that the integration of the explainability engine provides benefits beyond transparency alone — the action justification and policy visualisation outputs provide feedback that effectively guides the policy learning process toward more consistent and reliable coordination behaviours. This synergistic effect of explainability on learning performance represents a significant empirical finding that validates the design philosophy of the proposed framework.</w:t>
+      </w:r>
+    </w:p>
+    <w:p>
+      <w:pPr>
+        <w:pStyle w:val="Heading3"/>
         <w:spacing w:after="100" w:before="200"/>
       </w:pPr>
       <w:r>
@@ -27259,7 +27345,7 @@
           <w:sz w:val="24"/>
           <w:szCs w:val="24"/>
         </w:rPr>
-        <w:t xml:space="preserve">The coordination efficiency metrics in Table 4.4 confirm the superiority of the proposed framework across all three dimensions of operational performance. The task completion rate of 96.2% represents a 13.8 percentage point improvement over Traditional RL, a 7.3 percentage point improvement over MARL, and a 3.6 percentage point improvement over HRL. The coordination success rate of 95.4% similarly demonstrates strong improvements across all baselines, confirming that the framework's hierarchical coordination mechanism effectively orchestrates agent behaviors toward collective objectives with minimal coordination failures.</w:t>
+        <w:t xml:space="preserve">The coordination efficiency metrics in Table 4.4 confirm the superiority of the proposed framework across all three dimensions of operational performance. The task completion rate of 96.2% represents a 13.8 percentage point improvement over Traditional RL, a 7.3 percentage point improvement over MARL, and a 3.6 percentage point improvement over HRL. The coordination success rate of 95.4% similarly demonstrates strong improvements across all baselines, confirming that the framework's hierarchical coordination mechanism effectively orchestrates agent behaviours toward collective objectives with minimal coordination failures.</w:t>
       </w:r>
     </w:p>
     <w:p>
@@ -27278,6 +27364,7 @@
     </w:p>
     <w:p>
       <w:pPr>
+        <w:pStyle w:val="Heading3"/>
         <w:spacing w:after="100" w:before="200"/>
       </w:pPr>
       <w:r>
@@ -28248,6 +28335,7 @@
     </w:p>
     <w:p>
       <w:pPr>
+        <w:pStyle w:val="Heading3"/>
         <w:spacing w:after="100" w:before="200"/>
       </w:pPr>
       <w:r>
@@ -29037,6 +29125,7 @@
     </w:p>
     <w:p>
       <w:pPr>
+        <w:pStyle w:val="Heading3"/>
         <w:spacing w:after="100" w:before="200"/>
       </w:pPr>
       <w:r>
@@ -29061,11 +29150,12 @@
           <w:sz w:val="24"/>
           <w:szCs w:val="24"/>
         </w:rPr>
-        <w:t xml:space="preserve">The training and validation accuracy curves measured over 50 evaluation epochs demonstrate progressive improvement consistent with a well-regularized learning process. In the early training phases (epochs 1-15), both training and validation accuracy remain in the range of 75-82%, reflecting the initial exploration phase in which agents are learning basic environment navigation and resource collection behaviors. The accuracy improvement accelerates between epochs 15-35 as the agents begin to develop coordinated strategies that leverage the hierarchical policy structure. By epoch 35, both training and validation accuracy have crossed the 90% threshold, indicating the consolidation of effective coordination behaviors. The final epoch measurements of 96.4% training accuracy and 95.7% validation accuracy reflect well-generalized coordination policies with negligible overfitting.</w:t>
-      </w:r>
-    </w:p>
-    <w:p>
-      <w:pPr>
+        <w:t xml:space="preserve">The training and validation accuracy curves measured over 50 evaluation epochs demonstrate progressive improvement consistent with a well-regularized learning process. In the early training phases (epochs 1-15), both training and validation accuracy remain in the range of 75-82%, reflecting the initial exploration phase in which agents are learning basic environment navigation and resource collection behaviours. The accuracy improvement accelerates between epochs 15-35 as the agents begin to develop coordinated strategies that leverage the hierarchical policy structure. By epoch 35, both training and validation accuracy have crossed the 90% threshold, indicating the consolidation of effective coordination behaviours. The final epoch measurements of 96.4% training accuracy and 95.7% validation accuracy reflect well-generalised coordination policies with negligible overfitting.</w:t>
+      </w:r>
+    </w:p>
+    <w:p>
+      <w:pPr>
+        <w:pStyle w:val="Heading3"/>
         <w:spacing w:after="100" w:before="200"/>
       </w:pPr>
       <w:r>
@@ -29090,11 +29180,12 @@
           <w:sz w:val="24"/>
           <w:szCs w:val="24"/>
         </w:rPr>
-        <w:t xml:space="preserve">The loss curves mirror the accuracy dynamics: initial loss values of 0.89 (training) and 0.94 (validation) decline steadily as training progresses. The rate of loss reduction is fastest during the middle training phases (epochs 15-35) and stabilizes toward the end of training. The final loss values of 0.14 (training) and 0.17 (validation) confirm that the model has converged to a stable solution with minimal prediction error and acceptable generalization gap. The small discrepancy between training and validation loss (0.03) indicates that the regularization mechanisms, including the PPO clipping and entropy regularization, are effectively preventing overfitting.</w:t>
-      </w:r>
-    </w:p>
-    <w:p>
-      <w:pPr>
+        <w:t xml:space="preserve">The loss curves mirror the accuracy dynamics: initial loss values of 0.89 (training) and 0.94 (validation) decline steadily as training progresses. The rate of loss reduction is fastest during the middle training phases (epochs 15-35) and stabilizes toward the end of training. The final loss values of 0.14 (training) and 0.17 (validation) confirm that the model has converged to a stable solution with minimal prediction error and acceptable generalisation gap. The small discrepancy between training and validation loss (0.03) indicates that the regularization mechanisms, including the PPO clipping and entropy regularization, are effectively preventing overfitting.</w:t>
+      </w:r>
+    </w:p>
+    <w:p>
+      <w:pPr>
+        <w:pStyle w:val="Heading3"/>
         <w:spacing w:after="100" w:before="200"/>
       </w:pPr>
       <w:r>
@@ -29124,6 +29215,7 @@
     </w:p>
     <w:p>
       <w:pPr>
+        <w:pStyle w:val="Heading2"/>
         <w:spacing w:after="160" w:before="320"/>
       </w:pPr>
       <w:r>
@@ -29176,7 +29268,7 @@
           <w:sz w:val="24"/>
           <w:szCs w:val="24"/>
         </w:rPr>
-        <w:t xml:space="preserve">Second, the integration of the explainability engine provides measurable additional performance benefits beyond the baseline HRL approach. This finding challenges the common assumption that explainability and performance are inherently in tension, suggesting that the feedback loop created by the explanation generation process — through the decision trace logs and policy visualizations used to monitor and adjust training — provides a form of human-in-the-loop regularization that improves policy quality.</w:t>
+        <w:t xml:space="preserve">Second, the integration of the explainability engine provides measurable additional performance benefits beyond the baseline HRL approach. This finding challenges the common assumption that explainability and performance are inherently in tension, suggesting that the feedback loop created by the explanation generation process — through the decision trace logs and policy visualisations used to monitor and adjust training — provides a form of human-in-the-loop regularization that improves policy quality.</w:t>
       </w:r>
     </w:p>
     <w:p>
@@ -29223,6 +29315,7 @@
     </w:p>
     <w:p>
       <w:pPr>
+        <w:pStyle w:val="Heading2"/>
         <w:spacing w:after="160" w:before="320"/>
       </w:pPr>
       <w:r>
@@ -29247,7 +29340,7 @@
           <w:sz w:val="24"/>
           <w:szCs w:val="24"/>
         </w:rPr>
-        <w:t xml:space="preserve">This chapter has presented the implementation details and experimental evaluation of the EMAAI-HRL framework. The experimental results confirm the effectiveness of the proposed approach across classification performance, coordination efficiency, and explainability quality metrics. The proposed framework achieves state-of-the-art coordination performance with a task completion rate of 96.2%, classification accuracy of 96.4%, and AUC of 0.982, while providing high-quality decision transparency through an action explanation accuracy of 94.8% and interpretability rating of 8.7/10. The discussion of results has identified the hierarchical policy structure and the synergistic effect of the explainability engine as the primary drivers of performance improvement, and has highlighted scalability to large agent populations as a direction for future optimization. The following chapter presents the conclusions of the thesis and outlines the directions for future research.</w:t>
+        <w:t xml:space="preserve">This chapter has presented the implementation details and experimental evaluation of the EMAAI-HRL framework. The experimental results confirm the effectiveness of the proposed approach across classification performance, coordination efficiency, and explainability quality metrics. The proposed framework achieves state-of-the-art coordination performance with a task completion rate of 96.2%, classification accuracy of 96.4%, and AUC of 0.982, while providing high-quality decision transparency through an action explanation accuracy of 94.8% and interpretability rating of 8.7/10. The discussion of results has identified the hierarchical policy structure and the synergistic effect of the explainability engine as the primary drivers of performance improvement, and has highlighted scalability to large agent populations as a direction for future optimisation. The following chapter presents the conclusions of the thesis and outlines the directions for future research.</w:t>
       </w:r>
     </w:p>
     <w:p>
@@ -29260,6 +29353,7 @@
     </w:p>
     <w:p>
       <w:pPr>
+        <w:pStyle w:val="Heading1"/>
         <w:spacing w:after="400" w:before="200"/>
         <w:jc w:val="center"/>
       </w:pPr>
@@ -29294,6 +29388,7 @@
     </w:p>
     <w:p>
       <w:pPr>
+        <w:pStyle w:val="Heading2"/>
         <w:spacing w:after="160" w:before="320"/>
       </w:pPr>
       <w:r>
@@ -29332,7 +29427,7 @@
           <w:sz w:val="24"/>
           <w:szCs w:val="24"/>
         </w:rPr>
-        <w:t xml:space="preserve">The proposed framework integrates three principal components within a unified architecture: the Multi-Agent Coordination Layer, which manages agent interactions and environmental feedback within the shared coordination environment; the Hierarchical Reinforcement Learning Module, which implements a two-level policy hierarchy enabling strategic macro-action planning and fine-grained primitive action execution; and the Explainability Engine, which provides real-time action justification, policy visualization, and decision traceability capabilities that render agent decision-making comprehensible to human operators and system designers.</w:t>
+        <w:t xml:space="preserve">The proposed framework integrates three principal components within a unified architecture: the Multi-Agent Coordination Layer, which manages agent interactions and environmental feedback within the shared coordination environment; the Hierarchical Reinforcement Learning Module, which implements a two-level policy hierarchy enabling strategic macro-action planning and fine-grained primitive action execution; and the Explainability Engine, which provides real-time action justification, policy visualisation, and decision traceability capabilities that render agent decision-making comprehensible to human operators and system designers.</w:t>
       </w:r>
     </w:p>
     <w:p>
@@ -29346,7 +29441,7 @@
           <w:sz w:val="24"/>
           <w:szCs w:val="24"/>
         </w:rPr>
-        <w:t xml:space="preserve">The hierarchical policy structure, comprising a centralized high-level policy for macro-action assignment and decentralized low-level policies for primitive action execution, addresses the scalability limitations of conventional flat MARL approaches by decomposing complex coordination tasks into manageable sub-goal hierarchies. The two-level temporal abstraction reduces the effective search space for policy learning, accelerates convergence to stable coordination strategies, and provides natural points of abstraction at which the explanation engine can generate meaningful and contextually appropriate explanations.</w:t>
+        <w:t xml:space="preserve">The hierarchical policy structure, comprising a centralised high-level policy for macro-action assignment and decentralised low-level policies for primitive action execution, addresses the scalability limitations of conventional flat MARL approaches by decomposing complex coordination tasks into manageable sub-goal hierarchies. The two-level temporal abstraction reduces the effective search space for policy learning, accelerates convergence to stable coordination strategies, and provides natural points of abstraction at which the explanation engine can generate meaningful and contextually appropriate explanations.</w:t>
       </w:r>
     </w:p>
     <w:p>
@@ -29374,7 +29469,7 @@
           <w:sz w:val="24"/>
           <w:szCs w:val="24"/>
         </w:rPr>
-        <w:t xml:space="preserve">The training dynamics analysis reveals stable and progressive improvement in coordination performance over 50 evaluation epochs, with training accuracy reaching 96.4% and validation accuracy reaching 95.7% — a small generalization gap that confirms the effectiveness of the regularization mechanisms and the representational capacity of the learned policies. The training and validation loss values of 0.14 and 0.17 at epoch 50 confirm the convergence of the learning process to a stable and well-generalized solution.</w:t>
+        <w:t xml:space="preserve">The training dynamics analysis reveals stable and progressive improvement in coordination performance over 50 evaluation epochs, with training accuracy reaching 96.4% and validation accuracy reaching 95.7% — a small generalisation gap that confirms the effectiveness of the regularization mechanisms and the representational capacity of the learned policies. The training and validation loss values of 0.14 and 0.17 at epoch 50 confirm the convergence of the learning process to a stable and well-generalised solution.</w:t>
       </w:r>
     </w:p>
     <w:p>
@@ -29388,7 +29483,7 @@
           <w:sz w:val="24"/>
           <w:szCs w:val="24"/>
         </w:rPr>
-        <w:t xml:space="preserve">The ROC analysis, yielding an AUC of 0.982, demonstrates near-ideal discriminative capability of the framework in distinguishing between coordinated and non-coordinated agent behaviors — a critical capability for operational monitoring and anomaly detection in deployed autonomous systems. The Explainability Engine evaluation confirms action explanation accuracy of 94.8%, decision trace consistency of 96.2%, and an operator-assessed interpretability rating of 8.7 out of 10, establishing the framework as a genuinely trustworthy and operationally useful autonomous coordination system.</w:t>
+        <w:t xml:space="preserve">The ROC analysis, yielding an AUC of 0.982, demonstrates near-ideal discriminative capability of the framework in distinguishing between coordinated and non-coordinated agent behaviours — a critical capability for operational monitoring and anomaly detection in deployed autonomous systems. The Explainability Engine evaluation confirms action explanation accuracy of 94.8%, decision trace consistency of 96.2%, and an operator-assessed interpretability rating of 8.7 out of 10, establishing the framework as a genuinely trustworthy and operationally useful autonomous coordination system.</w:t>
       </w:r>
     </w:p>
     <w:p>
@@ -29402,11 +29497,12 @@
           <w:sz w:val="24"/>
           <w:szCs w:val="24"/>
         </w:rPr>
-        <w:t xml:space="preserve">A particularly significant finding of the research is the observation that the integration of the explainability engine provides measurable performance benefits beyond the baseline HRL approach, challenging the prevailing assumption that explainability and performance are necessarily in tension in complex learning systems. This finding suggests that principled integration of explanation mechanisms can provide beneficial feedback to the learning process, effectively creating a form of intrinsic regularization that promotes consistent and reliable coordination behaviors.</w:t>
-      </w:r>
-    </w:p>
-    <w:p>
-      <w:pPr>
+        <w:t xml:space="preserve">A particularly significant finding of the research is the observation that the integration of the explainability engine provides measurable performance benefits beyond the baseline HRL approach, challenging the prevailing assumption that explainability and performance are necessarily in tension in complex learning systems. This finding suggests that principled integration of explanation mechanisms can provide beneficial feedback to the learning process, effectively creating a form of intrinsic regularization that promotes consistent and reliable coordination behaviours.</w:t>
+      </w:r>
+    </w:p>
+    <w:p>
+      <w:pPr>
+        <w:pStyle w:val="Heading2"/>
         <w:spacing w:after="160" w:before="320"/>
       </w:pPr>
       <w:r>
@@ -29467,7 +29563,7 @@
           <w:sz w:val="24"/>
           <w:szCs w:val="24"/>
         </w:rPr>
-        <w:t xml:space="preserve">Hierarchical Multi-Agent Policy Design: The two-level hierarchical policy design — comprising a centralized high-level policy for global coordination strategy and decentralized low-level policies for individual agent execution — demonstrates superior coordination efficiency compared to both flat MARL and single-level HRL approaches. The policy design provides a replicable template for hierarchical multi-agent coordination systems in diverse application domains.</w:t>
+        <w:t xml:space="preserve">Hierarchical Multi-Agent Policy Design: The two-level hierarchical policy design — comprising a centralised high-level policy for global coordination strategy and decentralised low-level policies for individual agent execution — demonstrates superior coordination efficiency compared to both flat MARL and single-level HRL approaches. The policy design provides a replicable template for hierarchical multi-agent coordination systems in diverse application domains.</w:t>
       </w:r>
     </w:p>
     <w:p>
@@ -29485,7 +29581,7 @@
           <w:sz w:val="24"/>
           <w:szCs w:val="24"/>
         </w:rPr>
-        <w:t xml:space="preserve">Embedded Real-Time Explainability: The Explainability Engine provides three complementary explanation modalities — action justification, policy visualization, and decision traceability — that together offer a comprehensive and actionable account of agent decision-making. The gradient-based attribution mechanism enables real-time explanation generation with negligible computational overhead, making the framework suitable for operational deployment with continuous explanation monitoring.</w:t>
+        <w:t xml:space="preserve">Embedded Real-Time Explainability: The Explainability Engine provides three complementary explanation modalities — action justification, policy visualisation, and decision traceability — that together offer a comprehensive and actionable account of agent decision-making. The gradient-based attribution mechanism enables real-time explanation generation with negligible computational overhead, making the framework suitable for operational deployment with continuous explanation monitoring.</w:t>
       </w:r>
     </w:p>
     <w:p>
@@ -29557,6 +29653,7 @@
     </w:p>
     <w:p>
       <w:pPr>
+        <w:pStyle w:val="Heading2"/>
         <w:spacing w:after="160" w:before="320"/>
       </w:pPr>
       <w:r>
@@ -29595,7 +29692,7 @@
           <w:sz w:val="24"/>
           <w:szCs w:val="24"/>
         </w:rPr>
-        <w:t xml:space="preserve">The scalability of the current framework has been evaluated only for agent populations of up to 20 agents. The centralized high-level policy architecture, which processes the global state representation of all agents simultaneously, will face increasing computational challenges as the agent population scales beyond this range. While the modular architecture supports the replacement of the centralized high-level policy with scalable alternatives — such as attention-based or factorized policy representations — this extension has not been implemented and evaluated within the current research.</w:t>
+        <w:t xml:space="preserve">The scalability of the current framework has been evaluated only for agent populations of up to 20 agents. The centralised high-level policy architecture, which processes the global state representation of all agents simultaneously, will face increasing computational challenges as the agent population scales beyond this range. While the modular architecture supports the replacement of the centralised high-level policy with scalable alternatives — such as attention-based or factorized policy representations — this extension has not been implemented and evaluated within the current research.</w:t>
       </w:r>
     </w:p>
     <w:p>
@@ -29609,7 +29706,7 @@
           <w:sz w:val="24"/>
           <w:szCs w:val="24"/>
         </w:rPr>
-        <w:t xml:space="preserve">The explainability mechanisms developed in this research provide local, decision-level explanations of individual agent actions but do not address the generation of global, system-level explanations of the overall coordination strategy. System-level explanations, which characterize the emergent coordination behaviors of the agent population as a whole, would require additional analysis and representation mechanisms beyond the scope of the current work.</w:t>
+        <w:t xml:space="preserve">The explainability mechanisms developed in this research provide local, decision-level explanations of individual agent actions but do not address the generation of global, system-level explanations of the overall coordination strategy. System-level explanations, which characterise the emergent coordination behaviours of the agent population as a whole, would require additional analysis and representation mechanisms beyond the scope of the current work.</w:t>
       </w:r>
     </w:p>
     <w:p>
@@ -29628,6 +29725,7 @@
     </w:p>
     <w:p>
       <w:pPr>
+        <w:pStyle w:val="Heading2"/>
         <w:spacing w:after="160" w:before="320"/>
       </w:pPr>
       <w:r>
@@ -29741,6 +29839,7 @@
     </w:p>
     <w:p>
       <w:pPr>
+        <w:pStyle w:val="Heading2"/>
         <w:spacing w:after="160" w:before="320"/>
       </w:pPr>
       <w:r>
@@ -29792,6 +29891,7 @@
     </w:p>
     <w:p>
       <w:pPr>
+        <w:pStyle w:val="Heading1"/>
         <w:spacing w:after="400" w:before="200"/>
         <w:jc w:val="center"/>
       </w:pPr>
@@ -29858,7 +29958,7 @@
           <w:sz w:val="24"/>
           <w:szCs w:val="24"/>
         </w:rPr>
-        <w:t xml:space="preserve">[3]   Z. Abbas and M. Rasool, "Unpredictable Intelligence: Exploring Emergent Behaviors in Autonomous Agents Driven by Reinforcement Learning Dynamics," arXiv preprint arXiv:2502.xxxxx, 2025.</w:t>
+        <w:t xml:space="preserve">[3]   Z. Abbas and M. Rasool, "Unpredictable Intelligence: Exploring Emergent Behaviours in Autonomous Agents Driven by Reinforcement Learning Dynamics," arXiv preprint arXiv:2502.xxxxx, 2025.</w:t>
       </w:r>
     </w:p>
     <w:p>
@@ -29998,7 +30098,7 @@
           <w:sz w:val="24"/>
           <w:szCs w:val="24"/>
         </w:rPr>
-        <w:t xml:space="preserve">[13]  T. Li, G. Wang, Q. Fu, M. Zhao, and X. Liu, "Hierarchical reinforcement learning with opponent modeling for command and control system," Complex and Intelligent Systems, vol. 12, no. 1, p. 20, Jan. 2026, doi: 10.1007/s40747-025-02128-9.</w:t>
+        <w:t xml:space="preserve">[13]  T. Li, G. Wang, Q. Fu, M. Zhao, and X. Liu, "Hierarchical reinforcement learning with opponent modelling for command and control system," Complex and Intelligent Systems, vol. 12, no. 1, p. 20, Jan. 2026, doi: 10.1007/s40747-025-02128-9.</w:t>
       </w:r>
     </w:p>
     <w:p>
@@ -30138,7 +30238,7 @@
           <w:sz w:val="24"/>
           <w:szCs w:val="24"/>
         </w:rPr>
-        <w:t xml:space="preserve">[20]  J. Schulman, F. Wolski, P. Dhariwal, A. Radford, and O. Klimov, "Proximal policy optimization algorithms," arXiv preprint arXiv:1707.06347, 2017.</w:t>
+        <w:t xml:space="preserve">[20]  J. Schulman, F. Wolski, P. Dhariwal, A. Radford, and O. Klimov, "Proximal policy optimisation algorithms," arXiv preprint arXiv:1707.06347, 2017.</w:t>
       </w:r>
     </w:p>
     <w:p>
@@ -30236,7 +30336,7 @@
           <w:sz w:val="24"/>
           <w:szCs w:val="24"/>
         </w:rPr>
-        <w:t xml:space="preserve">[27]  D. Szer, F. Charpillet, and S. Zilberstein, "MAA*: A heuristic search algorithm for solving decentralized POMDPs," in Proc. 21st Conf. Uncertainty in Artificial Intelligence (UAI), 2005, pp. 576–583.</w:t>
+        <w:t xml:space="preserve">[27]  D. Szer, F. Charpillet, and S. Zilberstein, "MAA*: A heuristic search algorithm for solving decentralised POMDPs," in Proc. 21st Conf. Uncertainty in Artificial Intelligence (UAI), 2005, pp. 576–583.</w:t>
       </w:r>
     </w:p>
     <w:p>
@@ -30250,7 +30350,7 @@
           <w:sz w:val="24"/>
           <w:szCs w:val="24"/>
         </w:rPr>
-        <w:t xml:space="preserve">[28]  P. Maes and R. Brooks, "Learning to coordinate behaviors," in Proc. 8th Nat. Conf. Artificial Intelligence (AAAI), 1990, pp. 796–802.</w:t>
+        <w:t xml:space="preserve">[28]  P. Maes and R. Brooks, "Learning to coordinate behaviours," in Proc. 8th Nat. Conf. Artificial Intelligence (AAAI), 1990, pp. 796–802.</w:t>
       </w:r>
     </w:p>
     <w:p>
@@ -30278,7 +30378,7 @@
           <w:sz w:val="24"/>
           <w:szCs w:val="24"/>
         </w:rPr>
-        <w:t xml:space="preserve">[30]  C. Guestrin, C. Faloutsos, R. Tibshirani, and J. Lafferty, "Distributed regression: An efficient framework for modeling sensor network data," in Proc. 3rd Int. Symp. Information Processing in Sensor Networks (IPSN), 2004, pp. 1–10.</w:t>
+        <w:t xml:space="preserve">[30]  C. Guestrin, C. Faloutsos, R. Tibshirani, and J. Lafferty, "Distributed regression: An efficient framework for modelling sensor network data," in Proc. 3rd Int. Symp. Information Processing in Sensor Networks (IPSN), 2004, pp. 1–10.</w:t>
       </w:r>
     </w:p>
     <w:sectPr>

</xml_diff>